<commit_message>
TS 6.2 Tamil Sanskrit Kramam Jatai compare
</commit_message>
<xml_diff>
--- a/TS-Kramam/TS-6.2/TS 6.2 Sanskrit Krama Paatam Corrections.docx
+++ b/TS-Kramam/TS-6.2/TS 6.2 Sanskrit Krama Paatam Corrections.docx
@@ -1,6 +1,6 @@
 
 <file path=word/document.xml><?xml version="1.0" encoding="utf-8"?>
-<w:document xmlns:wpc="http://schemas.microsoft.com/office/word/2010/wordprocessingCanvas" xmlns:cx="http://schemas.microsoft.com/office/drawing/2014/chartex" xmlns:cx1="http://schemas.microsoft.com/office/drawing/2015/9/8/chartex" xmlns:cx2="http://schemas.microsoft.com/office/drawing/2015/10/21/chartex" xmlns:cx3="http://schemas.microsoft.com/office/drawing/2016/5/9/chartex" xmlns:cx4="http://schemas.microsoft.com/office/drawing/2016/5/10/chartex" xmlns:cx5="http://schemas.microsoft.com/office/drawing/2016/5/11/chartex" xmlns:cx6="http://schemas.microsoft.com/office/drawing/2016/5/12/chartex" xmlns:cx7="http://schemas.microsoft.com/office/drawing/2016/5/13/chartex" xmlns:cx8="http://schemas.microsoft.com/office/drawing/2016/5/14/chartex" xmlns:mc="http://schemas.openxmlformats.org/markup-compatibility/2006" xmlns:aink="http://schemas.microsoft.com/office/drawing/2016/ink" xmlns:am3d="http://schemas.microsoft.com/office/drawing/2017/model3d" xmlns:o="urn:schemas-microsoft-com:office:office" xmlns:oel="http://schemas.microsoft.com/office/2019/extlst" xmlns:r="http://schemas.openxmlformats.org/officeDocument/2006/relationships" xmlns:m="http://schemas.openxmlformats.org/officeDocument/2006/math" xmlns:v="urn:schemas-microsoft-com:vml" xmlns:wp14="http://schemas.microsoft.com/office/word/2010/wordprocessingDrawing" xmlns:wp="http://schemas.openxmlformats.org/drawingml/2006/wordprocessingDrawing" xmlns:w10="urn:schemas-microsoft-com:office:word" xmlns:w="http://schemas.openxmlformats.org/wordprocessingml/2006/main" xmlns:w14="http://schemas.microsoft.com/office/word/2010/wordml" xmlns:w15="http://schemas.microsoft.com/office/word/2012/wordml" xmlns:w16cei="http://schemas.microsoft.com/office/word/2026/wordml/cei" xmlns:w16cex="http://schemas.microsoft.com/office/word/2018/wordml/cex" xmlns:w16cid="http://schemas.microsoft.com/office/word/2016/wordml/cid" xmlns:w16="http://schemas.microsoft.com/office/word/2018/wordml" xmlns:w16du="http://schemas.microsoft.com/office/word/2023/wordml/word16du" xmlns:w16sdtdh="http://schemas.microsoft.com/office/word/2020/wordml/sdtdatahash" xmlns:w16sdtfl="http://schemas.microsoft.com/office/word/2024/wordml/sdtformatlock" xmlns:w16se="http://schemas.microsoft.com/office/word/2015/wordml/symex" xmlns:wpg="http://schemas.microsoft.com/office/word/2010/wordprocessingGroup" xmlns:wpi="http://schemas.microsoft.com/office/word/2010/wordprocessingInk" xmlns:wne="http://schemas.microsoft.com/office/word/2006/wordml" xmlns:wps="http://schemas.microsoft.com/office/word/2010/wordprocessingShape" mc:Ignorable="w14 w15 w16se w16cid w16 w16cex w16sdtdh w16sdtfl w16du wp14">
+<w:document xmlns:wpc="http://schemas.microsoft.com/office/word/2010/wordprocessingCanvas" xmlns:cx="http://schemas.microsoft.com/office/drawing/2014/chartex" xmlns:cx1="http://schemas.microsoft.com/office/drawing/2015/9/8/chartex" xmlns:cx2="http://schemas.microsoft.com/office/drawing/2015/10/21/chartex" xmlns:cx3="http://schemas.microsoft.com/office/drawing/2016/5/9/chartex" xmlns:cx4="http://schemas.microsoft.com/office/drawing/2016/5/10/chartex" xmlns:cx5="http://schemas.microsoft.com/office/drawing/2016/5/11/chartex" xmlns:cx6="http://schemas.microsoft.com/office/drawing/2016/5/12/chartex" xmlns:cx7="http://schemas.microsoft.com/office/drawing/2016/5/13/chartex" xmlns:cx8="http://schemas.microsoft.com/office/drawing/2016/5/14/chartex" xmlns:mc="http://schemas.openxmlformats.org/markup-compatibility/2006" xmlns:aink="http://schemas.microsoft.com/office/drawing/2016/ink" xmlns:am3d="http://schemas.microsoft.com/office/drawing/2017/model3d" xmlns:o="urn:schemas-microsoft-com:office:office" xmlns:oel="http://schemas.microsoft.com/office/2019/extlst" xmlns:r="http://schemas.openxmlformats.org/officeDocument/2006/relationships" xmlns:m="http://schemas.openxmlformats.org/officeDocument/2006/math" xmlns:v="urn:schemas-microsoft-com:vml" xmlns:wp14="http://schemas.microsoft.com/office/word/2010/wordprocessingDrawing" xmlns:wp="http://schemas.openxmlformats.org/drawingml/2006/wordprocessingDrawing" xmlns:w10="urn:schemas-microsoft-com:office:word" xmlns:w="http://schemas.openxmlformats.org/wordprocessingml/2006/main" xmlns:w14="http://schemas.microsoft.com/office/word/2010/wordml" xmlns:w15="http://schemas.microsoft.com/office/word/2012/wordml" xmlns:w16cex="http://schemas.microsoft.com/office/word/2018/wordml/cex" xmlns:w16cid="http://schemas.microsoft.com/office/word/2016/wordml/cid" xmlns:w16="http://schemas.microsoft.com/office/word/2018/wordml" xmlns:w16du="http://schemas.microsoft.com/office/word/2023/wordml/word16du" xmlns:w16sdtdh="http://schemas.microsoft.com/office/word/2020/wordml/sdtdatahash" xmlns:w16sdtfl="http://schemas.microsoft.com/office/word/2024/wordml/sdtformatlock" xmlns:w16se="http://schemas.microsoft.com/office/word/2015/wordml/symex" xmlns:wpg="http://schemas.microsoft.com/office/word/2010/wordprocessingGroup" xmlns:wpi="http://schemas.microsoft.com/office/word/2010/wordprocessingInk" xmlns:wne="http://schemas.microsoft.com/office/word/2006/wordml" xmlns:wps="http://schemas.microsoft.com/office/word/2010/wordprocessingShape" mc:Ignorable="w14 w15 w16se w16cid w16 w16cex w16sdtdh w16sdtfl w16du wp14">
   <w:body>
     <w:p>
       <w:pPr>
@@ -101,18 +101,7 @@
           <w:szCs w:val="32"/>
           <w:u w:val="single"/>
         </w:rPr>
-        <w:t xml:space="preserve">Observed </w:t>
-      </w:r>
-      <w:proofErr w:type="gramStart"/>
-      <w:r>
-        <w:rPr>
-          <w:b/>
-          <w:bCs/>
-          <w:sz w:val="32"/>
-          <w:szCs w:val="32"/>
-          <w:u w:val="single"/>
-        </w:rPr>
-        <w:t xml:space="preserve">till </w:t>
+        <w:t xml:space="preserve">Observed till </w:t>
       </w:r>
       <w:r>
         <w:rPr>
@@ -125,7 +114,6 @@
         </w:rPr>
         <w:t>????</w:t>
       </w:r>
-      <w:proofErr w:type="gramEnd"/>
     </w:p>
     <w:p>
       <w:pPr>
@@ -816,6 +804,1305 @@
       </w:tr>
       <w:tr>
         <w:trPr>
+          <w:trHeight w:val="1387"/>
+        </w:trPr>
+        <w:tc>
+          <w:tcPr>
+            <w:tcW w:w="3828" w:type="dxa"/>
+            <w:tcBorders>
+              <w:top w:val="single" w:sz="4" w:space="0" w:color="000000"/>
+              <w:left w:val="single" w:sz="4" w:space="0" w:color="000000"/>
+              <w:bottom w:val="single" w:sz="4" w:space="0" w:color="000000"/>
+              <w:right w:val="single" w:sz="4" w:space="0" w:color="000000"/>
+            </w:tcBorders>
+          </w:tcPr>
+          <w:p>
+            <w:pPr>
+              <w:widowControl w:val="0"/>
+              <w:tabs>
+                <w:tab w:val="left" w:pos="993"/>
+              </w:tabs>
+              <w:autoSpaceDE w:val="0"/>
+              <w:autoSpaceDN w:val="0"/>
+              <w:adjustRightInd w:val="0"/>
+              <w:spacing w:before="0" w:line="240" w:lineRule="auto"/>
+              <w:ind w:right="297"/>
+              <w:rPr>
+                <w:rFonts w:cs="Arial"/>
+                <w:b/>
+                <w:color w:val="000000"/>
+                <w:sz w:val="28"/>
+                <w:szCs w:val="32"/>
+              </w:rPr>
+            </w:pPr>
+            <w:r>
+              <w:rPr>
+                <w:rFonts w:cs="Arial"/>
+                <w:b/>
+                <w:color w:val="000000"/>
+                <w:sz w:val="28"/>
+                <w:szCs w:val="32"/>
+              </w:rPr>
+              <w:t>T.S.</w:t>
+            </w:r>
+            <w:r>
+              <w:rPr>
+                <w:rFonts w:cs="Arial"/>
+                <w:b/>
+                <w:color w:val="000000"/>
+                <w:sz w:val="28"/>
+                <w:szCs w:val="32"/>
+              </w:rPr>
+              <w:t>6.2.8.1</w:t>
+            </w:r>
+            <w:r>
+              <w:rPr>
+                <w:rFonts w:cs="Arial"/>
+                <w:b/>
+                <w:color w:val="000000"/>
+                <w:sz w:val="28"/>
+                <w:szCs w:val="32"/>
+              </w:rPr>
+              <w:t>– Kramam</w:t>
+            </w:r>
+          </w:p>
+          <w:p>
+            <w:pPr>
+              <w:widowControl w:val="0"/>
+              <w:tabs>
+                <w:tab w:val="left" w:pos="993"/>
+              </w:tabs>
+              <w:autoSpaceDE w:val="0"/>
+              <w:autoSpaceDN w:val="0"/>
+              <w:adjustRightInd w:val="0"/>
+              <w:spacing w:before="0" w:line="240" w:lineRule="auto"/>
+              <w:ind w:right="297"/>
+              <w:rPr>
+                <w:rFonts w:cs="Arial"/>
+                <w:b/>
+                <w:color w:val="000000"/>
+                <w:sz w:val="28"/>
+                <w:szCs w:val="32"/>
+                <w:lang w:val="en-IN"/>
+              </w:rPr>
+            </w:pPr>
+            <w:r>
+              <w:rPr>
+                <w:rFonts w:cs="Arial"/>
+                <w:b/>
+                <w:color w:val="000000"/>
+                <w:sz w:val="28"/>
+                <w:szCs w:val="32"/>
+                <w:lang w:val="en-IN"/>
+              </w:rPr>
+              <w:t xml:space="preserve">Krama Vaakyam No.– </w:t>
+            </w:r>
+            <w:r>
+              <w:rPr>
+                <w:rFonts w:cs="Arial"/>
+                <w:b/>
+                <w:color w:val="000000"/>
+                <w:sz w:val="28"/>
+                <w:szCs w:val="32"/>
+                <w:lang w:val="en-IN"/>
+              </w:rPr>
+              <w:t>55,57</w:t>
+            </w:r>
+          </w:p>
+          <w:p>
+            <w:pPr>
+              <w:widowControl w:val="0"/>
+              <w:tabs>
+                <w:tab w:val="left" w:pos="993"/>
+              </w:tabs>
+              <w:autoSpaceDE w:val="0"/>
+              <w:autoSpaceDN w:val="0"/>
+              <w:adjustRightInd w:val="0"/>
+              <w:spacing w:before="0" w:line="240" w:lineRule="auto"/>
+              <w:ind w:right="297"/>
+              <w:rPr>
+                <w:rFonts w:cs="Arial"/>
+                <w:b/>
+                <w:color w:val="000000"/>
+                <w:sz w:val="28"/>
+                <w:szCs w:val="32"/>
+              </w:rPr>
+            </w:pPr>
+            <w:r>
+              <w:rPr>
+                <w:rFonts w:cs="Arial"/>
+                <w:b/>
+                <w:color w:val="000000"/>
+                <w:sz w:val="28"/>
+                <w:szCs w:val="32"/>
+                <w:lang w:val="it-IT"/>
+              </w:rPr>
+              <w:t>Panchaati No</w:t>
+            </w:r>
+            <w:r>
+              <w:rPr>
+                <w:rFonts w:cs="Arial"/>
+                <w:b/>
+                <w:color w:val="000000"/>
+                <w:szCs w:val="32"/>
+                <w:lang w:val="it-IT"/>
+              </w:rPr>
+              <w:t xml:space="preserve">. - </w:t>
+            </w:r>
+            <w:r>
+              <w:rPr>
+                <w:rFonts w:cs="Arial"/>
+                <w:b/>
+                <w:color w:val="000000"/>
+                <w:sz w:val="28"/>
+                <w:szCs w:val="28"/>
+                <w:lang w:val="it-IT"/>
+              </w:rPr>
+              <w:t>39</w:t>
+            </w:r>
+          </w:p>
+        </w:tc>
+        <w:tc>
+          <w:tcPr>
+            <w:tcW w:w="4678" w:type="dxa"/>
+            <w:tcBorders>
+              <w:top w:val="single" w:sz="4" w:space="0" w:color="000000"/>
+              <w:left w:val="single" w:sz="4" w:space="0" w:color="000000"/>
+              <w:bottom w:val="single" w:sz="4" w:space="0" w:color="000000"/>
+              <w:right w:val="single" w:sz="4" w:space="0" w:color="000000"/>
+            </w:tcBorders>
+          </w:tcPr>
+          <w:p>
+            <w:pPr>
+              <w:widowControl w:val="0"/>
+              <w:autoSpaceDE w:val="0"/>
+              <w:autoSpaceDN w:val="0"/>
+              <w:adjustRightInd w:val="0"/>
+              <w:spacing w:before="0" w:line="240" w:lineRule="auto"/>
+              <w:rPr>
+                <w:rFonts w:ascii="Latha" w:hAnsi="Latha" w:cs="Latha"/>
+                <w:sz w:val="28"/>
+                <w:szCs w:val="28"/>
+                <w:cs/>
+                <w:lang w:bidi="ta-IN"/>
+              </w:rPr>
+            </w:pPr>
+            <w:r>
+              <w:rPr>
+                <w:rFonts w:ascii="BRH Devanagari Extra" w:hAnsi="BRH Devanagari Extra" w:cs="BRH Devanagari Extra"/>
+                <w:color w:val="000000"/>
+                <w:sz w:val="40"/>
+                <w:szCs w:val="40"/>
+              </w:rPr>
+              <w:t>mÉë</w:t>
+            </w:r>
+            <w:r>
+              <w:rPr>
+                <w:rFonts w:ascii="BRH Malayalam Extra" w:hAnsi="BRH Malayalam Extra" w:cs="BRH Devanagari Extra"/>
+                <w:color w:val="000000"/>
+                <w:sz w:val="32"/>
+                <w:szCs w:val="40"/>
+              </w:rPr>
+              <w:t>–</w:t>
+            </w:r>
+            <w:r>
+              <w:rPr>
+                <w:rFonts w:ascii="BRH Devanagari Extra" w:hAnsi="BRH Devanagari Extra" w:cs="BRH Devanagari Extra"/>
+                <w:color w:val="000000"/>
+                <w:sz w:val="40"/>
+                <w:szCs w:val="40"/>
+              </w:rPr>
+              <w:t>eÉÉqÉç ÆÌuÉ</w:t>
+            </w:r>
+            <w:r>
+              <w:rPr>
+                <w:rFonts w:ascii="BRH Malayalam Extra" w:hAnsi="BRH Malayalam Extra" w:cs="BRH Devanagari Extra"/>
+                <w:color w:val="000000"/>
+                <w:sz w:val="32"/>
+                <w:szCs w:val="40"/>
+              </w:rPr>
+              <w:t>–</w:t>
+            </w:r>
+            <w:r>
+              <w:rPr>
+                <w:rFonts w:ascii="BRH Devanagari Extra" w:hAnsi="BRH Devanagari Extra" w:cs="BRH Devanagari Extra"/>
+                <w:color w:val="EE0000"/>
+                <w:sz w:val="40"/>
+                <w:szCs w:val="40"/>
+                <w:highlight w:val="yellow"/>
+              </w:rPr>
+              <w:t>iuÉÉ</w:t>
+            </w:r>
+            <w:r>
+              <w:rPr>
+                <w:rFonts w:ascii="BRH Devanagari Extra" w:hAnsi="BRH Devanagari Extra" w:cs="BRH Devanagari Extra"/>
+                <w:color w:val="EE0000"/>
+                <w:sz w:val="40"/>
+                <w:szCs w:val="40"/>
+              </w:rPr>
+              <w:t xml:space="preserve"> </w:t>
+            </w:r>
+            <w:r>
+              <w:rPr>
+                <w:rFonts w:ascii="BRH Devanagari Extra" w:hAnsi="BRH Devanagari Extra" w:cs="BRH Devanagari Extra"/>
+                <w:color w:val="000000"/>
+                <w:sz w:val="40"/>
+                <w:szCs w:val="40"/>
+              </w:rPr>
+              <w:t>| mÉë</w:t>
+            </w:r>
+            <w:r>
+              <w:rPr>
+                <w:rFonts w:ascii="BRH Malayalam Extra" w:hAnsi="BRH Malayalam Extra" w:cs="BRH Devanagari Extra"/>
+                <w:color w:val="000000"/>
+                <w:sz w:val="32"/>
+                <w:szCs w:val="40"/>
+              </w:rPr>
+              <w:t>–</w:t>
+            </w:r>
+            <w:r>
+              <w:rPr>
+                <w:rFonts w:ascii="BRH Devanagari Extra" w:hAnsi="BRH Devanagari Extra" w:cs="BRH Devanagari Extra"/>
+                <w:color w:val="000000"/>
+                <w:sz w:val="40"/>
+                <w:szCs w:val="40"/>
+              </w:rPr>
+              <w:t>eÉÉÍqÉÌiÉþ mÉë - eÉÉqÉç | ÌuÉ</w:t>
+            </w:r>
+            <w:r>
+              <w:rPr>
+                <w:rFonts w:ascii="BRH Malayalam Extra" w:hAnsi="BRH Malayalam Extra" w:cs="BRH Devanagari Extra"/>
+                <w:color w:val="000000"/>
+                <w:sz w:val="32"/>
+                <w:szCs w:val="40"/>
+              </w:rPr>
+              <w:t>–</w:t>
+            </w:r>
+            <w:r>
+              <w:rPr>
+                <w:rFonts w:ascii="BRH Devanagari Extra" w:hAnsi="BRH Devanagari Extra" w:cs="BRH Devanagari Extra"/>
+                <w:color w:val="EE0000"/>
+                <w:sz w:val="40"/>
+                <w:szCs w:val="40"/>
+                <w:highlight w:val="yellow"/>
+              </w:rPr>
+              <w:t>iuÉÉ</w:t>
+            </w:r>
+            <w:r>
+              <w:rPr>
+                <w:rFonts w:ascii="BRH Devanagari Extra" w:hAnsi="BRH Devanagari Extra" w:cs="BRH Devanagari Extra"/>
+                <w:color w:val="000000"/>
+                <w:sz w:val="40"/>
+                <w:szCs w:val="40"/>
+              </w:rPr>
+              <w:t>ÅMüÉþqÉrÉliÉ |</w:t>
+            </w:r>
+          </w:p>
+        </w:tc>
+        <w:tc>
+          <w:tcPr>
+            <w:tcW w:w="5244" w:type="dxa"/>
+            <w:tcBorders>
+              <w:top w:val="single" w:sz="4" w:space="0" w:color="000000"/>
+              <w:left w:val="single" w:sz="4" w:space="0" w:color="000000"/>
+              <w:bottom w:val="single" w:sz="4" w:space="0" w:color="000000"/>
+              <w:right w:val="single" w:sz="4" w:space="0" w:color="000000"/>
+            </w:tcBorders>
+          </w:tcPr>
+          <w:p>
+            <w:pPr>
+              <w:autoSpaceDE w:val="0"/>
+              <w:autoSpaceDN w:val="0"/>
+              <w:adjustRightInd w:val="0"/>
+              <w:spacing w:before="0" w:line="240" w:lineRule="auto"/>
+              <w:rPr>
+                <w:rFonts w:ascii="Latha" w:hAnsi="Latha" w:cs="Latha"/>
+                <w:sz w:val="28"/>
+                <w:szCs w:val="28"/>
+                <w:cs/>
+                <w:lang w:bidi="ta-IN"/>
+              </w:rPr>
+            </w:pPr>
+            <w:r>
+              <w:rPr>
+                <w:rFonts w:ascii="BRH Devanagari Extra" w:hAnsi="BRH Devanagari Extra" w:cs="BRH Devanagari Extra"/>
+                <w:color w:val="000000"/>
+                <w:sz w:val="40"/>
+                <w:szCs w:val="40"/>
+              </w:rPr>
+              <w:t>mÉë</w:t>
+            </w:r>
+            <w:r>
+              <w:rPr>
+                <w:rFonts w:ascii="BRH Malayalam Extra" w:hAnsi="BRH Malayalam Extra" w:cs="BRH Devanagari Extra"/>
+                <w:color w:val="000000"/>
+                <w:sz w:val="32"/>
+                <w:szCs w:val="40"/>
+              </w:rPr>
+              <w:t>–</w:t>
+            </w:r>
+            <w:r>
+              <w:rPr>
+                <w:rFonts w:ascii="BRH Devanagari Extra" w:hAnsi="BRH Devanagari Extra" w:cs="BRH Devanagari Extra"/>
+                <w:color w:val="000000"/>
+                <w:sz w:val="40"/>
+                <w:szCs w:val="40"/>
+              </w:rPr>
+              <w:t>eÉÉqÉç ÆÌuÉ</w:t>
+            </w:r>
+            <w:r>
+              <w:rPr>
+                <w:rFonts w:ascii="BRH Malayalam Extra" w:hAnsi="BRH Malayalam Extra" w:cs="BRH Devanagari Extra"/>
+                <w:color w:val="000000"/>
+                <w:sz w:val="32"/>
+                <w:szCs w:val="40"/>
+              </w:rPr>
+              <w:t>–</w:t>
+            </w:r>
+            <w:r>
+              <w:rPr>
+                <w:rFonts w:ascii="BRH Devanagari Extra" w:hAnsi="BRH Devanagari Extra" w:cs="BRH Devanagari Extra"/>
+                <w:color w:val="EE0000"/>
+                <w:sz w:val="40"/>
+                <w:szCs w:val="40"/>
+                <w:highlight w:val="yellow"/>
+              </w:rPr>
+              <w:t>iuÉÉ</w:t>
+            </w:r>
+            <w:r>
+              <w:rPr>
+                <w:rFonts w:ascii="BRH Devanagari Extra" w:hAnsi="BRH Devanagari Extra" w:cs="BRH Devanagari Extra"/>
+                <w:color w:val="EE0000"/>
+                <w:sz w:val="40"/>
+                <w:szCs w:val="40"/>
+              </w:rPr>
+              <w:t xml:space="preserve"> </w:t>
+            </w:r>
+            <w:r>
+              <w:rPr>
+                <w:rFonts w:ascii="BRH Devanagari Extra" w:hAnsi="BRH Devanagari Extra" w:cs="BRH Devanagari Extra"/>
+                <w:color w:val="000000"/>
+                <w:sz w:val="40"/>
+                <w:szCs w:val="40"/>
+              </w:rPr>
+              <w:t>| mÉë</w:t>
+            </w:r>
+            <w:r>
+              <w:rPr>
+                <w:rFonts w:ascii="BRH Malayalam Extra" w:hAnsi="BRH Malayalam Extra" w:cs="BRH Devanagari Extra"/>
+                <w:color w:val="000000"/>
+                <w:sz w:val="32"/>
+                <w:szCs w:val="40"/>
+              </w:rPr>
+              <w:t>–</w:t>
+            </w:r>
+            <w:r>
+              <w:rPr>
+                <w:rFonts w:ascii="BRH Devanagari Extra" w:hAnsi="BRH Devanagari Extra" w:cs="BRH Devanagari Extra"/>
+                <w:color w:val="000000"/>
+                <w:sz w:val="40"/>
+                <w:szCs w:val="40"/>
+              </w:rPr>
+              <w:t>eÉÉÍqÉÌiÉþ mÉë - eÉÉqÉç | ÌuÉ</w:t>
+            </w:r>
+            <w:r>
+              <w:rPr>
+                <w:rFonts w:ascii="BRH Malayalam Extra" w:hAnsi="BRH Malayalam Extra" w:cs="BRH Devanagari Extra"/>
+                <w:color w:val="000000"/>
+                <w:sz w:val="32"/>
+                <w:szCs w:val="40"/>
+              </w:rPr>
+              <w:t>–</w:t>
+            </w:r>
+            <w:r>
+              <w:rPr>
+                <w:rFonts w:ascii="BRH Devanagari Extra" w:hAnsi="BRH Devanagari Extra" w:cs="BRH Devanagari Extra"/>
+                <w:color w:val="EE0000"/>
+                <w:sz w:val="40"/>
+                <w:szCs w:val="40"/>
+                <w:highlight w:val="yellow"/>
+              </w:rPr>
+              <w:t>iuÉÉ</w:t>
+            </w:r>
+            <w:r>
+              <w:rPr>
+                <w:rFonts w:ascii="BRH Devanagari Extra" w:hAnsi="BRH Devanagari Extra" w:cs="BRH Devanagari Extra"/>
+                <w:color w:val="000000"/>
+                <w:sz w:val="40"/>
+                <w:szCs w:val="40"/>
+              </w:rPr>
+              <w:t>ÅMüÉþqÉrÉliÉ |</w:t>
+            </w:r>
+          </w:p>
+        </w:tc>
+      </w:tr>
+      <w:tr>
+        <w:trPr>
+          <w:trHeight w:val="1387"/>
+        </w:trPr>
+        <w:tc>
+          <w:tcPr>
+            <w:tcW w:w="3828" w:type="dxa"/>
+            <w:tcBorders>
+              <w:top w:val="single" w:sz="4" w:space="0" w:color="000000"/>
+              <w:left w:val="single" w:sz="4" w:space="0" w:color="000000"/>
+              <w:bottom w:val="single" w:sz="4" w:space="0" w:color="000000"/>
+              <w:right w:val="single" w:sz="4" w:space="0" w:color="000000"/>
+            </w:tcBorders>
+          </w:tcPr>
+          <w:p>
+            <w:pPr>
+              <w:widowControl w:val="0"/>
+              <w:tabs>
+                <w:tab w:val="left" w:pos="993"/>
+              </w:tabs>
+              <w:autoSpaceDE w:val="0"/>
+              <w:autoSpaceDN w:val="0"/>
+              <w:adjustRightInd w:val="0"/>
+              <w:spacing w:before="0" w:line="240" w:lineRule="auto"/>
+              <w:ind w:right="297"/>
+              <w:rPr>
+                <w:rFonts w:cs="Arial"/>
+                <w:b/>
+                <w:color w:val="000000"/>
+                <w:sz w:val="28"/>
+                <w:szCs w:val="28"/>
+              </w:rPr>
+            </w:pPr>
+            <w:r>
+              <w:rPr>
+                <w:rFonts w:cs="Arial"/>
+                <w:b/>
+                <w:color w:val="000000"/>
+                <w:sz w:val="28"/>
+                <w:szCs w:val="28"/>
+              </w:rPr>
+              <w:t>T.S.6.2.8.2– Kramam</w:t>
+            </w:r>
+          </w:p>
+          <w:p>
+            <w:pPr>
+              <w:widowControl w:val="0"/>
+              <w:tabs>
+                <w:tab w:val="left" w:pos="993"/>
+              </w:tabs>
+              <w:autoSpaceDE w:val="0"/>
+              <w:autoSpaceDN w:val="0"/>
+              <w:adjustRightInd w:val="0"/>
+              <w:spacing w:before="0" w:line="240" w:lineRule="auto"/>
+              <w:ind w:right="297"/>
+              <w:rPr>
+                <w:rFonts w:cs="Arial"/>
+                <w:b/>
+                <w:color w:val="000000"/>
+                <w:sz w:val="28"/>
+                <w:szCs w:val="28"/>
+                <w:lang w:val="en-IN"/>
+              </w:rPr>
+            </w:pPr>
+            <w:r>
+              <w:rPr>
+                <w:rFonts w:cs="Arial"/>
+                <w:b/>
+                <w:color w:val="000000"/>
+                <w:sz w:val="28"/>
+                <w:szCs w:val="28"/>
+                <w:lang w:val="en-IN"/>
+              </w:rPr>
+              <w:t xml:space="preserve">Krama Vaakyam No.– </w:t>
+            </w:r>
+            <w:r>
+              <w:rPr>
+                <w:rFonts w:cs="Arial"/>
+                <w:b/>
+                <w:color w:val="000000"/>
+                <w:sz w:val="28"/>
+                <w:szCs w:val="28"/>
+                <w:lang w:val="en-IN"/>
+              </w:rPr>
+              <w:t>17,18</w:t>
+            </w:r>
+          </w:p>
+          <w:p>
+            <w:pPr>
+              <w:widowControl w:val="0"/>
+              <w:tabs>
+                <w:tab w:val="left" w:pos="993"/>
+              </w:tabs>
+              <w:autoSpaceDE w:val="0"/>
+              <w:autoSpaceDN w:val="0"/>
+              <w:adjustRightInd w:val="0"/>
+              <w:spacing w:before="0" w:line="240" w:lineRule="auto"/>
+              <w:ind w:right="297"/>
+              <w:rPr>
+                <w:rFonts w:cs="Arial"/>
+                <w:b/>
+                <w:color w:val="000000"/>
+                <w:sz w:val="28"/>
+                <w:szCs w:val="32"/>
+              </w:rPr>
+            </w:pPr>
+            <w:r>
+              <w:rPr>
+                <w:rFonts w:cs="Arial"/>
+                <w:b/>
+                <w:color w:val="000000"/>
+                <w:sz w:val="28"/>
+                <w:szCs w:val="28"/>
+                <w:lang w:val="it-IT"/>
+              </w:rPr>
+              <w:t>Panchaati No. - 40</w:t>
+            </w:r>
+          </w:p>
+        </w:tc>
+        <w:tc>
+          <w:tcPr>
+            <w:tcW w:w="4678" w:type="dxa"/>
+            <w:tcBorders>
+              <w:top w:val="single" w:sz="4" w:space="0" w:color="000000"/>
+              <w:left w:val="single" w:sz="4" w:space="0" w:color="000000"/>
+              <w:bottom w:val="single" w:sz="4" w:space="0" w:color="000000"/>
+              <w:right w:val="single" w:sz="4" w:space="0" w:color="000000"/>
+            </w:tcBorders>
+          </w:tcPr>
+          <w:p>
+            <w:pPr>
+              <w:widowControl w:val="0"/>
+              <w:autoSpaceDE w:val="0"/>
+              <w:autoSpaceDN w:val="0"/>
+              <w:adjustRightInd w:val="0"/>
+              <w:spacing w:before="0" w:line="240" w:lineRule="auto"/>
+              <w:rPr>
+                <w:rFonts w:ascii="Latha" w:hAnsi="Latha" w:cs="Latha"/>
+                <w:sz w:val="28"/>
+                <w:szCs w:val="28"/>
+                <w:cs/>
+                <w:lang w:bidi="ta-IN"/>
+              </w:rPr>
+            </w:pPr>
+            <w:r>
+              <w:rPr>
+                <w:rFonts w:ascii="BRH Devanagari Extra" w:hAnsi="BRH Devanagari Extra" w:cs="BRH Devanagari Extra"/>
+                <w:color w:val="000000"/>
+                <w:sz w:val="40"/>
+                <w:szCs w:val="40"/>
+              </w:rPr>
+              <w:t>mÉ</w:t>
+            </w:r>
+            <w:r>
+              <w:rPr>
+                <w:rFonts w:ascii="BRH Malayalam Extra" w:hAnsi="BRH Malayalam Extra" w:cs="BRH Devanagari Extra"/>
+                <w:color w:val="000000"/>
+                <w:sz w:val="32"/>
+                <w:szCs w:val="40"/>
+              </w:rPr>
+              <w:t>–</w:t>
+            </w:r>
+            <w:r>
+              <w:rPr>
+                <w:rFonts w:ascii="BRH Devanagari Extra" w:hAnsi="BRH Devanagari Extra" w:cs="BRH Devanagari Extra"/>
+                <w:color w:val="000000"/>
+                <w:sz w:val="40"/>
+                <w:szCs w:val="40"/>
+              </w:rPr>
+              <w:t>zÉÔlÉç. ÌuÉ</w:t>
+            </w:r>
+            <w:r>
+              <w:rPr>
+                <w:rFonts w:ascii="BRH Malayalam Extra" w:hAnsi="BRH Malayalam Extra" w:cs="BRH Devanagari Extra"/>
+                <w:color w:val="000000"/>
+                <w:sz w:val="32"/>
+                <w:szCs w:val="40"/>
+              </w:rPr>
+              <w:t>–</w:t>
+            </w:r>
+            <w:r>
+              <w:rPr>
+                <w:rFonts w:ascii="BRH Devanagari Extra" w:hAnsi="BRH Devanagari Extra" w:cs="BRH Devanagari Extra"/>
+                <w:color w:val="EE0000"/>
+                <w:sz w:val="40"/>
+                <w:szCs w:val="40"/>
+                <w:highlight w:val="yellow"/>
+              </w:rPr>
+              <w:t>iuÉÉ</w:t>
+            </w:r>
+            <w:r>
+              <w:rPr>
+                <w:rFonts w:ascii="BRH Devanagari Extra" w:hAnsi="BRH Devanagari Extra" w:cs="BRH Devanagari Extra"/>
+                <w:color w:val="000000"/>
+                <w:sz w:val="40"/>
+                <w:szCs w:val="40"/>
+              </w:rPr>
+              <w:t xml:space="preserve"> | ÌuÉ</w:t>
+            </w:r>
+            <w:r>
+              <w:rPr>
+                <w:rFonts w:ascii="BRH Malayalam Extra" w:hAnsi="BRH Malayalam Extra" w:cs="BRH Devanagari Extra"/>
+                <w:color w:val="EE0000"/>
+                <w:sz w:val="32"/>
+                <w:szCs w:val="40"/>
+                <w:highlight w:val="yellow"/>
+              </w:rPr>
+              <w:t>–</w:t>
+            </w:r>
+            <w:r>
+              <w:rPr>
+                <w:rFonts w:ascii="BRH Devanagari Extra" w:hAnsi="BRH Devanagari Extra" w:cs="BRH Devanagari Extra"/>
+                <w:color w:val="EE0000"/>
+                <w:sz w:val="40"/>
+                <w:szCs w:val="40"/>
+                <w:highlight w:val="yellow"/>
+              </w:rPr>
+              <w:t>iuÉÉ</w:t>
+            </w:r>
+            <w:r>
+              <w:rPr>
+                <w:rFonts w:ascii="BRH Devanagari Extra" w:hAnsi="BRH Devanagari Extra" w:cs="BRH Devanagari Extra"/>
+                <w:color w:val="000000"/>
+                <w:sz w:val="40"/>
+                <w:szCs w:val="40"/>
+              </w:rPr>
+              <w:t xml:space="preserve">ÅMüÉþqÉrÉliÉ </w:t>
+            </w:r>
+          </w:p>
+        </w:tc>
+        <w:tc>
+          <w:tcPr>
+            <w:tcW w:w="5244" w:type="dxa"/>
+            <w:tcBorders>
+              <w:top w:val="single" w:sz="4" w:space="0" w:color="000000"/>
+              <w:left w:val="single" w:sz="4" w:space="0" w:color="000000"/>
+              <w:bottom w:val="single" w:sz="4" w:space="0" w:color="000000"/>
+              <w:right w:val="single" w:sz="4" w:space="0" w:color="000000"/>
+            </w:tcBorders>
+          </w:tcPr>
+          <w:p>
+            <w:pPr>
+              <w:autoSpaceDE w:val="0"/>
+              <w:autoSpaceDN w:val="0"/>
+              <w:adjustRightInd w:val="0"/>
+              <w:spacing w:before="0" w:line="240" w:lineRule="auto"/>
+              <w:rPr>
+                <w:rFonts w:ascii="Latha" w:hAnsi="Latha" w:cs="Latha"/>
+                <w:sz w:val="28"/>
+                <w:szCs w:val="28"/>
+                <w:cs/>
+                <w:lang w:bidi="ta-IN"/>
+              </w:rPr>
+            </w:pPr>
+            <w:r>
+              <w:rPr>
+                <w:rFonts w:ascii="BRH Devanagari Extra" w:hAnsi="BRH Devanagari Extra" w:cs="BRH Devanagari Extra"/>
+                <w:color w:val="000000"/>
+                <w:sz w:val="40"/>
+                <w:szCs w:val="40"/>
+              </w:rPr>
+              <w:t>mÉ</w:t>
+            </w:r>
+            <w:r>
+              <w:rPr>
+                <w:rFonts w:ascii="BRH Malayalam Extra" w:hAnsi="BRH Malayalam Extra" w:cs="BRH Devanagari Extra"/>
+                <w:color w:val="000000"/>
+                <w:sz w:val="32"/>
+                <w:szCs w:val="40"/>
+              </w:rPr>
+              <w:t>–</w:t>
+            </w:r>
+            <w:r>
+              <w:rPr>
+                <w:rFonts w:ascii="BRH Devanagari Extra" w:hAnsi="BRH Devanagari Extra" w:cs="BRH Devanagari Extra"/>
+                <w:color w:val="000000"/>
+                <w:sz w:val="40"/>
+                <w:szCs w:val="40"/>
+              </w:rPr>
+              <w:t>zÉÔlÉç. ÌuÉ</w:t>
+            </w:r>
+            <w:r>
+              <w:rPr>
+                <w:rFonts w:ascii="BRH Malayalam Extra" w:hAnsi="BRH Malayalam Extra" w:cs="BRH Devanagari Extra"/>
+                <w:color w:val="000000"/>
+                <w:sz w:val="32"/>
+                <w:szCs w:val="40"/>
+              </w:rPr>
+              <w:t>–</w:t>
+            </w:r>
+            <w:r>
+              <w:rPr>
+                <w:rFonts w:ascii="BRH Devanagari Extra" w:hAnsi="BRH Devanagari Extra" w:cs="BRH Devanagari Extra"/>
+                <w:color w:val="EE0000"/>
+                <w:sz w:val="40"/>
+                <w:szCs w:val="40"/>
+                <w:highlight w:val="yellow"/>
+              </w:rPr>
+              <w:t>iuÉÉ</w:t>
+            </w:r>
+            <w:r>
+              <w:rPr>
+                <w:rFonts w:ascii="BRH Devanagari Extra" w:hAnsi="BRH Devanagari Extra" w:cs="BRH Devanagari Extra"/>
+                <w:color w:val="000000"/>
+                <w:sz w:val="40"/>
+                <w:szCs w:val="40"/>
+              </w:rPr>
+              <w:t xml:space="preserve"> | ÌuÉ</w:t>
+            </w:r>
+            <w:r>
+              <w:rPr>
+                <w:rFonts w:ascii="BRH Malayalam Extra" w:hAnsi="BRH Malayalam Extra" w:cs="BRH Devanagari Extra"/>
+                <w:color w:val="EE0000"/>
+                <w:sz w:val="32"/>
+                <w:szCs w:val="40"/>
+                <w:highlight w:val="yellow"/>
+              </w:rPr>
+              <w:t>–</w:t>
+            </w:r>
+            <w:r>
+              <w:rPr>
+                <w:rFonts w:ascii="BRH Devanagari Extra" w:hAnsi="BRH Devanagari Extra" w:cs="BRH Devanagari Extra"/>
+                <w:color w:val="EE0000"/>
+                <w:sz w:val="40"/>
+                <w:szCs w:val="40"/>
+                <w:highlight w:val="yellow"/>
+              </w:rPr>
+              <w:t>iuÉÉ</w:t>
+            </w:r>
+            <w:r>
+              <w:rPr>
+                <w:rFonts w:ascii="BRH Devanagari Extra" w:hAnsi="BRH Devanagari Extra" w:cs="BRH Devanagari Extra"/>
+                <w:color w:val="000000"/>
+                <w:sz w:val="40"/>
+                <w:szCs w:val="40"/>
+              </w:rPr>
+              <w:t xml:space="preserve">ÅMüÉþqÉrÉliÉ | </w:t>
+            </w:r>
+          </w:p>
+        </w:tc>
+      </w:tr>
+      <w:tr>
+        <w:trPr>
+          <w:trHeight w:val="1387"/>
+        </w:trPr>
+        <w:tc>
+          <w:tcPr>
+            <w:tcW w:w="3828" w:type="dxa"/>
+            <w:tcBorders>
+              <w:top w:val="single" w:sz="4" w:space="0" w:color="000000"/>
+              <w:left w:val="single" w:sz="4" w:space="0" w:color="000000"/>
+              <w:bottom w:val="single" w:sz="4" w:space="0" w:color="000000"/>
+              <w:right w:val="single" w:sz="4" w:space="0" w:color="000000"/>
+            </w:tcBorders>
+          </w:tcPr>
+          <w:p>
+            <w:pPr>
+              <w:widowControl w:val="0"/>
+              <w:tabs>
+                <w:tab w:val="left" w:pos="993"/>
+              </w:tabs>
+              <w:autoSpaceDE w:val="0"/>
+              <w:autoSpaceDN w:val="0"/>
+              <w:adjustRightInd w:val="0"/>
+              <w:spacing w:before="0" w:line="240" w:lineRule="auto"/>
+              <w:ind w:right="297"/>
+              <w:rPr>
+                <w:rFonts w:cs="Arial"/>
+                <w:b/>
+                <w:color w:val="000000"/>
+                <w:sz w:val="28"/>
+                <w:szCs w:val="28"/>
+              </w:rPr>
+            </w:pPr>
+            <w:r>
+              <w:rPr>
+                <w:rFonts w:cs="Arial"/>
+                <w:b/>
+                <w:color w:val="000000"/>
+                <w:sz w:val="28"/>
+                <w:szCs w:val="28"/>
+              </w:rPr>
+              <w:t>T.S.6.2.8.2– Kramam</w:t>
+            </w:r>
+          </w:p>
+          <w:p>
+            <w:pPr>
+              <w:widowControl w:val="0"/>
+              <w:tabs>
+                <w:tab w:val="left" w:pos="993"/>
+              </w:tabs>
+              <w:autoSpaceDE w:val="0"/>
+              <w:autoSpaceDN w:val="0"/>
+              <w:adjustRightInd w:val="0"/>
+              <w:spacing w:before="0" w:line="240" w:lineRule="auto"/>
+              <w:ind w:right="297"/>
+              <w:rPr>
+                <w:rFonts w:cs="Arial"/>
+                <w:b/>
+                <w:color w:val="000000"/>
+                <w:sz w:val="28"/>
+                <w:szCs w:val="28"/>
+                <w:lang w:val="en-IN"/>
+              </w:rPr>
+            </w:pPr>
+            <w:r>
+              <w:rPr>
+                <w:rFonts w:cs="Arial"/>
+                <w:b/>
+                <w:color w:val="000000"/>
+                <w:sz w:val="28"/>
+                <w:szCs w:val="28"/>
+                <w:lang w:val="en-IN"/>
+              </w:rPr>
+              <w:t xml:space="preserve">Krama Vaakyam No.– </w:t>
+            </w:r>
+            <w:r>
+              <w:rPr>
+                <w:rFonts w:cs="Arial"/>
+                <w:b/>
+                <w:color w:val="000000"/>
+                <w:sz w:val="28"/>
+                <w:szCs w:val="28"/>
+                <w:lang w:val="en-IN"/>
+              </w:rPr>
+              <w:t>39 &amp; 41</w:t>
+            </w:r>
+          </w:p>
+          <w:p>
+            <w:pPr>
+              <w:widowControl w:val="0"/>
+              <w:tabs>
+                <w:tab w:val="left" w:pos="993"/>
+              </w:tabs>
+              <w:autoSpaceDE w:val="0"/>
+              <w:autoSpaceDN w:val="0"/>
+              <w:adjustRightInd w:val="0"/>
+              <w:spacing w:before="0" w:line="240" w:lineRule="auto"/>
+              <w:ind w:right="297"/>
+              <w:rPr>
+                <w:rFonts w:cs="Arial"/>
+                <w:b/>
+                <w:color w:val="000000"/>
+                <w:sz w:val="28"/>
+                <w:szCs w:val="28"/>
+              </w:rPr>
+            </w:pPr>
+            <w:r>
+              <w:rPr>
+                <w:rFonts w:cs="Arial"/>
+                <w:b/>
+                <w:color w:val="000000"/>
+                <w:sz w:val="28"/>
+                <w:szCs w:val="28"/>
+                <w:lang w:val="it-IT"/>
+              </w:rPr>
+              <w:t>Panchaati No. - 40</w:t>
+            </w:r>
+          </w:p>
+        </w:tc>
+        <w:tc>
+          <w:tcPr>
+            <w:tcW w:w="4678" w:type="dxa"/>
+            <w:tcBorders>
+              <w:top w:val="single" w:sz="4" w:space="0" w:color="000000"/>
+              <w:left w:val="single" w:sz="4" w:space="0" w:color="000000"/>
+              <w:bottom w:val="single" w:sz="4" w:space="0" w:color="000000"/>
+              <w:right w:val="single" w:sz="4" w:space="0" w:color="000000"/>
+            </w:tcBorders>
+          </w:tcPr>
+          <w:p>
+            <w:pPr>
+              <w:widowControl w:val="0"/>
+              <w:autoSpaceDE w:val="0"/>
+              <w:autoSpaceDN w:val="0"/>
+              <w:adjustRightInd w:val="0"/>
+              <w:spacing w:line="252" w:lineRule="auto"/>
+              <w:rPr>
+                <w:rFonts w:ascii="BRH Devanagari Extra" w:hAnsi="BRH Devanagari Extra" w:cs="BRH Devanagari Extra"/>
+                <w:color w:val="000000"/>
+                <w:sz w:val="40"/>
+                <w:szCs w:val="40"/>
+              </w:rPr>
+            </w:pPr>
+            <w:r>
+              <w:rPr>
+                <w:rFonts w:ascii="BRH Devanagari Extra" w:hAnsi="BRH Devanagari Extra" w:cs="BRH Devanagari Extra"/>
+                <w:color w:val="000000"/>
+                <w:sz w:val="40"/>
+                <w:szCs w:val="40"/>
+              </w:rPr>
+              <w:t>mÉë</w:t>
+            </w:r>
+            <w:r>
+              <w:rPr>
+                <w:rFonts w:ascii="BRH Malayalam Extra" w:hAnsi="BRH Malayalam Extra" w:cs="BRH Devanagari Extra"/>
+                <w:color w:val="000000"/>
+                <w:sz w:val="32"/>
+                <w:szCs w:val="40"/>
+              </w:rPr>
+              <w:t>–</w:t>
+            </w:r>
+            <w:r>
+              <w:rPr>
+                <w:rFonts w:ascii="BRH Devanagari Extra" w:hAnsi="BRH Devanagari Extra" w:cs="BRH Devanagari Extra"/>
+                <w:color w:val="000000"/>
+                <w:sz w:val="40"/>
+                <w:szCs w:val="40"/>
+              </w:rPr>
+              <w:t>ÌiÉ</w:t>
+            </w:r>
+            <w:r>
+              <w:rPr>
+                <w:rFonts w:ascii="BRH Malayalam Extra" w:hAnsi="BRH Malayalam Extra" w:cs="BRH Devanagari Extra"/>
+                <w:color w:val="000000"/>
+                <w:sz w:val="32"/>
+                <w:szCs w:val="40"/>
+              </w:rPr>
+              <w:t>–</w:t>
+            </w:r>
+            <w:r>
+              <w:rPr>
+                <w:rFonts w:ascii="BRH Devanagari Extra" w:hAnsi="BRH Devanagari Extra" w:cs="BRH Devanagari Extra"/>
+                <w:color w:val="000000"/>
+                <w:sz w:val="40"/>
+                <w:szCs w:val="40"/>
+              </w:rPr>
+              <w:t>¸ÉqÉç ÆÌuÉ</w:t>
+            </w:r>
+            <w:r>
+              <w:rPr>
+                <w:rFonts w:ascii="BRH Malayalam Extra" w:hAnsi="BRH Malayalam Extra" w:cs="BRH Devanagari Extra"/>
+                <w:color w:val="EE0000"/>
+                <w:sz w:val="32"/>
+                <w:szCs w:val="40"/>
+                <w:highlight w:val="yellow"/>
+              </w:rPr>
+              <w:t>–</w:t>
+            </w:r>
+            <w:r>
+              <w:rPr>
+                <w:rFonts w:ascii="BRH Devanagari Extra" w:hAnsi="BRH Devanagari Extra" w:cs="BRH Devanagari Extra"/>
+                <w:color w:val="EE0000"/>
+                <w:sz w:val="40"/>
+                <w:szCs w:val="40"/>
+                <w:highlight w:val="yellow"/>
+              </w:rPr>
+              <w:t>iuÉÉ</w:t>
+            </w:r>
+            <w:r>
+              <w:rPr>
+                <w:rFonts w:ascii="BRH Devanagari Extra" w:hAnsi="BRH Devanagari Extra" w:cs="BRH Devanagari Extra"/>
+                <w:color w:val="000000"/>
+                <w:sz w:val="40"/>
+                <w:szCs w:val="40"/>
+              </w:rPr>
+              <w:t xml:space="preserve"> | </w:t>
+            </w:r>
+          </w:p>
+          <w:p>
+            <w:pPr>
+              <w:widowControl w:val="0"/>
+              <w:autoSpaceDE w:val="0"/>
+              <w:autoSpaceDN w:val="0"/>
+              <w:adjustRightInd w:val="0"/>
+              <w:spacing w:before="0" w:line="240" w:lineRule="auto"/>
+              <w:rPr>
+                <w:rFonts w:ascii="Latha" w:hAnsi="Latha" w:cs="Latha"/>
+                <w:sz w:val="28"/>
+                <w:szCs w:val="28"/>
+                <w:cs/>
+                <w:lang w:bidi="ta-IN"/>
+              </w:rPr>
+            </w:pPr>
+            <w:r>
+              <w:rPr>
+                <w:rFonts w:ascii="BRH Devanagari Extra" w:hAnsi="BRH Devanagari Extra" w:cs="BRH Devanagari Extra"/>
+                <w:color w:val="000000"/>
+                <w:sz w:val="40"/>
+                <w:szCs w:val="40"/>
+              </w:rPr>
+              <w:t>mÉë</w:t>
+            </w:r>
+            <w:r>
+              <w:rPr>
+                <w:rFonts w:ascii="BRH Malayalam Extra" w:hAnsi="BRH Malayalam Extra" w:cs="BRH Devanagari Extra"/>
+                <w:color w:val="000000"/>
+                <w:sz w:val="32"/>
+                <w:szCs w:val="40"/>
+              </w:rPr>
+              <w:t>–</w:t>
+            </w:r>
+            <w:r>
+              <w:rPr>
+                <w:rFonts w:ascii="BRH Devanagari Extra" w:hAnsi="BRH Devanagari Extra" w:cs="BRH Devanagari Extra"/>
+                <w:color w:val="000000"/>
+                <w:sz w:val="40"/>
+                <w:szCs w:val="40"/>
+              </w:rPr>
+              <w:t>ÌiÉ</w:t>
+            </w:r>
+            <w:r>
+              <w:rPr>
+                <w:rFonts w:ascii="BRH Malayalam Extra" w:hAnsi="BRH Malayalam Extra" w:cs="BRH Devanagari Extra"/>
+                <w:color w:val="000000"/>
+                <w:sz w:val="32"/>
+                <w:szCs w:val="40"/>
+              </w:rPr>
+              <w:t>–</w:t>
+            </w:r>
+            <w:r>
+              <w:rPr>
+                <w:rFonts w:ascii="BRH Devanagari Extra" w:hAnsi="BRH Devanagari Extra" w:cs="BRH Devanagari Extra"/>
+                <w:color w:val="000000"/>
+                <w:sz w:val="40"/>
+                <w:szCs w:val="40"/>
+              </w:rPr>
+              <w:t xml:space="preserve">¸ÉÍqÉÌiÉþ mÉëÌiÉ - xjÉÉqÉç | </w:t>
+            </w:r>
+            <w:r>
+              <w:rPr>
+                <w:rFonts w:ascii="BRH Devanagari Extra" w:hAnsi="BRH Devanagari Extra" w:cs="BRH Devanagari Extra"/>
+                <w:color w:val="000000"/>
+                <w:sz w:val="40"/>
+                <w:szCs w:val="40"/>
+              </w:rPr>
+              <w:br/>
+            </w:r>
+            <w:r>
+              <w:rPr>
+                <w:rFonts w:ascii="BRH Devanagari Extra" w:hAnsi="BRH Devanagari Extra" w:cs="BRH Devanagari Extra"/>
+                <w:color w:val="000000"/>
+                <w:sz w:val="40"/>
+                <w:szCs w:val="40"/>
+              </w:rPr>
+              <w:t>ÌuÉ</w:t>
+            </w:r>
+            <w:r>
+              <w:rPr>
+                <w:rFonts w:ascii="BRH Malayalam Extra" w:hAnsi="BRH Malayalam Extra" w:cs="BRH Devanagari Extra"/>
+                <w:color w:val="000000"/>
+                <w:sz w:val="32"/>
+                <w:szCs w:val="40"/>
+              </w:rPr>
+              <w:t>–</w:t>
+            </w:r>
+            <w:r>
+              <w:rPr>
+                <w:rFonts w:ascii="BRH Devanagari Extra" w:hAnsi="BRH Devanagari Extra" w:cs="BRH Devanagari Extra"/>
+                <w:color w:val="EE0000"/>
+                <w:sz w:val="40"/>
+                <w:szCs w:val="40"/>
+                <w:highlight w:val="yellow"/>
+              </w:rPr>
+              <w:t>iuÉÉ</w:t>
+            </w:r>
+            <w:r>
+              <w:rPr>
+                <w:rFonts w:ascii="BRH Devanagari Extra" w:hAnsi="BRH Devanagari Extra" w:cs="BRH Devanagari Extra"/>
+                <w:color w:val="000000"/>
+                <w:sz w:val="40"/>
+                <w:szCs w:val="40"/>
+              </w:rPr>
+              <w:t>ÅMüÉþqÉrÉliÉ |</w:t>
+            </w:r>
+            <w:r>
+              <w:rPr>
+                <w:rFonts w:ascii="Latha" w:hAnsi="Latha" w:cs="Latha"/>
+                <w:sz w:val="28"/>
+                <w:szCs w:val="28"/>
+                <w:lang w:bidi="ta-IN"/>
+              </w:rPr>
+              <w:t xml:space="preserve"> </w:t>
+            </w:r>
+          </w:p>
+        </w:tc>
+        <w:tc>
+          <w:tcPr>
+            <w:tcW w:w="5244" w:type="dxa"/>
+            <w:tcBorders>
+              <w:top w:val="single" w:sz="4" w:space="0" w:color="000000"/>
+              <w:left w:val="single" w:sz="4" w:space="0" w:color="000000"/>
+              <w:bottom w:val="single" w:sz="4" w:space="0" w:color="000000"/>
+              <w:right w:val="single" w:sz="4" w:space="0" w:color="000000"/>
+            </w:tcBorders>
+          </w:tcPr>
+          <w:p>
+            <w:pPr>
+              <w:widowControl w:val="0"/>
+              <w:autoSpaceDE w:val="0"/>
+              <w:autoSpaceDN w:val="0"/>
+              <w:adjustRightInd w:val="0"/>
+              <w:spacing w:line="252" w:lineRule="auto"/>
+              <w:rPr>
+                <w:rFonts w:ascii="BRH Devanagari Extra" w:hAnsi="BRH Devanagari Extra" w:cs="BRH Devanagari Extra"/>
+                <w:color w:val="000000"/>
+                <w:sz w:val="40"/>
+                <w:szCs w:val="40"/>
+              </w:rPr>
+            </w:pPr>
+            <w:r>
+              <w:rPr>
+                <w:rFonts w:ascii="BRH Devanagari Extra" w:hAnsi="BRH Devanagari Extra" w:cs="BRH Devanagari Extra"/>
+                <w:color w:val="000000"/>
+                <w:sz w:val="40"/>
+                <w:szCs w:val="40"/>
+              </w:rPr>
+              <w:t>mÉë</w:t>
+            </w:r>
+            <w:r>
+              <w:rPr>
+                <w:rFonts w:ascii="BRH Malayalam Extra" w:hAnsi="BRH Malayalam Extra" w:cs="BRH Devanagari Extra"/>
+                <w:color w:val="000000"/>
+                <w:sz w:val="32"/>
+                <w:szCs w:val="40"/>
+              </w:rPr>
+              <w:t>–</w:t>
+            </w:r>
+            <w:r>
+              <w:rPr>
+                <w:rFonts w:ascii="BRH Devanagari Extra" w:hAnsi="BRH Devanagari Extra" w:cs="BRH Devanagari Extra"/>
+                <w:color w:val="000000"/>
+                <w:sz w:val="40"/>
+                <w:szCs w:val="40"/>
+              </w:rPr>
+              <w:t>ÌiÉ</w:t>
+            </w:r>
+            <w:r>
+              <w:rPr>
+                <w:rFonts w:ascii="BRH Malayalam Extra" w:hAnsi="BRH Malayalam Extra" w:cs="BRH Devanagari Extra"/>
+                <w:color w:val="000000"/>
+                <w:sz w:val="32"/>
+                <w:szCs w:val="40"/>
+              </w:rPr>
+              <w:t>–</w:t>
+            </w:r>
+            <w:r>
+              <w:rPr>
+                <w:rFonts w:ascii="BRH Devanagari Extra" w:hAnsi="BRH Devanagari Extra" w:cs="BRH Devanagari Extra"/>
+                <w:color w:val="000000"/>
+                <w:sz w:val="40"/>
+                <w:szCs w:val="40"/>
+              </w:rPr>
+              <w:t>¸ÉqÉç ÆÌuÉ</w:t>
+            </w:r>
+            <w:r>
+              <w:rPr>
+                <w:rFonts w:ascii="BRH Malayalam Extra" w:hAnsi="BRH Malayalam Extra" w:cs="BRH Devanagari Extra"/>
+                <w:color w:val="EE0000"/>
+                <w:sz w:val="32"/>
+                <w:szCs w:val="40"/>
+                <w:highlight w:val="yellow"/>
+              </w:rPr>
+              <w:t>–</w:t>
+            </w:r>
+            <w:r>
+              <w:rPr>
+                <w:rFonts w:ascii="BRH Devanagari Extra" w:hAnsi="BRH Devanagari Extra" w:cs="BRH Devanagari Extra"/>
+                <w:color w:val="EE0000"/>
+                <w:sz w:val="40"/>
+                <w:szCs w:val="40"/>
+                <w:highlight w:val="yellow"/>
+              </w:rPr>
+              <w:t>iuÉÉ</w:t>
+            </w:r>
+            <w:r>
+              <w:rPr>
+                <w:rFonts w:ascii="BRH Devanagari Extra" w:hAnsi="BRH Devanagari Extra" w:cs="BRH Devanagari Extra"/>
+                <w:color w:val="000000"/>
+                <w:sz w:val="40"/>
+                <w:szCs w:val="40"/>
+              </w:rPr>
+              <w:t xml:space="preserve"> | </w:t>
+            </w:r>
+          </w:p>
+          <w:p>
+            <w:pPr>
+              <w:autoSpaceDE w:val="0"/>
+              <w:autoSpaceDN w:val="0"/>
+              <w:adjustRightInd w:val="0"/>
+              <w:spacing w:before="0" w:line="240" w:lineRule="auto"/>
+              <w:rPr>
+                <w:rFonts w:ascii="Latha" w:hAnsi="Latha" w:cs="Latha"/>
+                <w:sz w:val="28"/>
+                <w:szCs w:val="28"/>
+                <w:cs/>
+                <w:lang w:bidi="ta-IN"/>
+              </w:rPr>
+            </w:pPr>
+            <w:r>
+              <w:rPr>
+                <w:rFonts w:ascii="BRH Devanagari Extra" w:hAnsi="BRH Devanagari Extra" w:cs="BRH Devanagari Extra"/>
+                <w:color w:val="000000"/>
+                <w:sz w:val="40"/>
+                <w:szCs w:val="40"/>
+              </w:rPr>
+              <w:t>mÉë</w:t>
+            </w:r>
+            <w:r>
+              <w:rPr>
+                <w:rFonts w:ascii="BRH Malayalam Extra" w:hAnsi="BRH Malayalam Extra" w:cs="BRH Devanagari Extra"/>
+                <w:color w:val="000000"/>
+                <w:sz w:val="32"/>
+                <w:szCs w:val="40"/>
+              </w:rPr>
+              <w:t>–</w:t>
+            </w:r>
+            <w:r>
+              <w:rPr>
+                <w:rFonts w:ascii="BRH Devanagari Extra" w:hAnsi="BRH Devanagari Extra" w:cs="BRH Devanagari Extra"/>
+                <w:color w:val="000000"/>
+                <w:sz w:val="40"/>
+                <w:szCs w:val="40"/>
+              </w:rPr>
+              <w:t>ÌiÉ</w:t>
+            </w:r>
+            <w:r>
+              <w:rPr>
+                <w:rFonts w:ascii="BRH Malayalam Extra" w:hAnsi="BRH Malayalam Extra" w:cs="BRH Devanagari Extra"/>
+                <w:color w:val="000000"/>
+                <w:sz w:val="32"/>
+                <w:szCs w:val="40"/>
+              </w:rPr>
+              <w:t>–</w:t>
+            </w:r>
+            <w:r>
+              <w:rPr>
+                <w:rFonts w:ascii="BRH Devanagari Extra" w:hAnsi="BRH Devanagari Extra" w:cs="BRH Devanagari Extra"/>
+                <w:color w:val="000000"/>
+                <w:sz w:val="40"/>
+                <w:szCs w:val="40"/>
+              </w:rPr>
+              <w:t>¸ÉÍqÉÌiÉþ mÉëÌiÉ - xjÉÉqÉç | ÌuÉ</w:t>
+            </w:r>
+            <w:r>
+              <w:rPr>
+                <w:rFonts w:ascii="BRH Malayalam Extra" w:hAnsi="BRH Malayalam Extra" w:cs="BRH Devanagari Extra"/>
+                <w:color w:val="000000"/>
+                <w:sz w:val="32"/>
+                <w:szCs w:val="40"/>
+              </w:rPr>
+              <w:t>–</w:t>
+            </w:r>
+            <w:r>
+              <w:rPr>
+                <w:rFonts w:ascii="BRH Devanagari Extra" w:hAnsi="BRH Devanagari Extra" w:cs="BRH Devanagari Extra"/>
+                <w:color w:val="EE0000"/>
+                <w:sz w:val="40"/>
+                <w:szCs w:val="40"/>
+                <w:highlight w:val="yellow"/>
+              </w:rPr>
+              <w:t>iuÉÉ</w:t>
+            </w:r>
+            <w:r>
+              <w:rPr>
+                <w:rFonts w:ascii="BRH Devanagari Extra" w:hAnsi="BRH Devanagari Extra" w:cs="BRH Devanagari Extra"/>
+                <w:color w:val="000000"/>
+                <w:sz w:val="40"/>
+                <w:szCs w:val="40"/>
+              </w:rPr>
+              <w:t>ÅMüÉþqÉrÉliÉ |</w:t>
+            </w:r>
+          </w:p>
+        </w:tc>
+      </w:tr>
+      <w:tr>
+        <w:trPr>
           <w:trHeight w:val="1111"/>
         </w:trPr>
         <w:tc>
@@ -855,6 +2142,7 @@
                 <w:sz w:val="28"/>
                 <w:szCs w:val="32"/>
               </w:rPr>
+              <w:lastRenderedPageBreak/>
               <w:t>T.S.</w:t>
             </w:r>
             <w:r>
@@ -1658,97 +2946,6 @@
           </w:p>
         </w:tc>
       </w:tr>
-      <w:tr>
-        <w:trPr>
-          <w:trHeight w:val="1671"/>
-        </w:trPr>
-        <w:tc>
-          <w:tcPr>
-            <w:tcW w:w="3828" w:type="dxa"/>
-            <w:tcBorders>
-              <w:top w:val="single" w:sz="4" w:space="0" w:color="000000"/>
-              <w:left w:val="single" w:sz="4" w:space="0" w:color="000000"/>
-              <w:bottom w:val="single" w:sz="4" w:space="0" w:color="auto"/>
-              <w:right w:val="single" w:sz="4" w:space="0" w:color="000000"/>
-            </w:tcBorders>
-          </w:tcPr>
-          <w:p>
-            <w:pPr>
-              <w:widowControl w:val="0"/>
-              <w:tabs>
-                <w:tab w:val="left" w:pos="993"/>
-              </w:tabs>
-              <w:autoSpaceDE w:val="0"/>
-              <w:autoSpaceDN w:val="0"/>
-              <w:adjustRightInd w:val="0"/>
-              <w:spacing w:before="0" w:line="240" w:lineRule="auto"/>
-              <w:ind w:right="297"/>
-              <w:rPr>
-                <w:rFonts w:cs="Arial"/>
-                <w:b/>
-                <w:color w:val="000000"/>
-                <w:sz w:val="28"/>
-                <w:szCs w:val="32"/>
-                <w:lang w:val="it-IT"/>
-              </w:rPr>
-            </w:pPr>
-          </w:p>
-        </w:tc>
-        <w:tc>
-          <w:tcPr>
-            <w:tcW w:w="4678" w:type="dxa"/>
-            <w:tcBorders>
-              <w:top w:val="single" w:sz="4" w:space="0" w:color="000000"/>
-              <w:left w:val="single" w:sz="4" w:space="0" w:color="000000"/>
-              <w:bottom w:val="single" w:sz="4" w:space="0" w:color="auto"/>
-              <w:right w:val="single" w:sz="4" w:space="0" w:color="000000"/>
-            </w:tcBorders>
-          </w:tcPr>
-          <w:p>
-            <w:pPr>
-              <w:widowControl w:val="0"/>
-              <w:autoSpaceDE w:val="0"/>
-              <w:autoSpaceDN w:val="0"/>
-              <w:adjustRightInd w:val="0"/>
-              <w:spacing w:before="0" w:line="240" w:lineRule="auto"/>
-              <w:rPr>
-                <w:rFonts w:ascii="BRH Devanagari Extra" w:hAnsi="BRH Devanagari Extra" w:cs="BRH Devanagari Extra"/>
-                <w:color w:val="000000"/>
-                <w:sz w:val="40"/>
-                <w:szCs w:val="40"/>
-                <w:lang w:val="it-IT"/>
-              </w:rPr>
-            </w:pPr>
-          </w:p>
-        </w:tc>
-        <w:tc>
-          <w:tcPr>
-            <w:tcW w:w="5244" w:type="dxa"/>
-            <w:tcBorders>
-              <w:top w:val="single" w:sz="4" w:space="0" w:color="000000"/>
-              <w:left w:val="single" w:sz="4" w:space="0" w:color="000000"/>
-              <w:bottom w:val="single" w:sz="4" w:space="0" w:color="auto"/>
-              <w:right w:val="single" w:sz="4" w:space="0" w:color="000000"/>
-            </w:tcBorders>
-          </w:tcPr>
-          <w:p>
-            <w:pPr>
-              <w:widowControl w:val="0"/>
-              <w:autoSpaceDE w:val="0"/>
-              <w:autoSpaceDN w:val="0"/>
-              <w:adjustRightInd w:val="0"/>
-              <w:spacing w:before="0" w:line="240" w:lineRule="auto"/>
-              <w:rPr>
-                <w:rFonts w:ascii="BRH Devanagari Extra" w:hAnsi="BRH Devanagari Extra" w:cs="BRH Devanagari Extra"/>
-                <w:color w:val="000000"/>
-                <w:sz w:val="40"/>
-                <w:szCs w:val="40"/>
-                <w:lang w:val="it-IT"/>
-              </w:rPr>
-            </w:pPr>
-          </w:p>
-        </w:tc>
-      </w:tr>
     </w:tbl>
     <w:p>
       <w:pPr>
@@ -1762,6 +2959,17 @@
           <w:lang w:val="it-IT"/>
         </w:rPr>
       </w:pPr>
+      <w:r>
+        <w:rPr>
+          <w:b/>
+          <w:bCs/>
+          <w:sz w:val="32"/>
+          <w:szCs w:val="32"/>
+          <w:u w:val="single"/>
+          <w:lang w:val="it-IT"/>
+        </w:rPr>
+        <w:t>============================================</w:t>
+      </w:r>
     </w:p>
     <w:p>
       <w:pPr>
@@ -1947,7 +3155,6 @@
                 <w:sz w:val="32"/>
                 <w:szCs w:val="32"/>
               </w:rPr>
-              <w:lastRenderedPageBreak/>
               <w:t>Section, Paragraph</w:t>
             </w:r>
           </w:p>
@@ -2558,6 +3765,9 @@
     </w:tbl>
     <w:p>
       <w:pPr>
+        <w:pBdr>
+          <w:bottom w:val="double" w:sz="6" w:space="1" w:color="auto"/>
+        </w:pBdr>
         <w:jc w:val="center"/>
         <w:rPr>
           <w:b/>
@@ -2567,7 +3777,10 @@
           <w:u w:val="single"/>
         </w:rPr>
       </w:pPr>
-      <w:r>
+    </w:p>
+    <w:p>
+      <w:pPr>
+        <w:jc w:val="center"/>
         <w:rPr>
           <w:b/>
           <w:bCs/>
@@ -2575,8 +3788,43 @@
           <w:szCs w:val="32"/>
           <w:u w:val="single"/>
         </w:rPr>
-        <w:t>==========</w:t>
-      </w:r>
+      </w:pPr>
+    </w:p>
+    <w:p>
+      <w:pPr>
+        <w:jc w:val="center"/>
+        <w:rPr>
+          <w:b/>
+          <w:bCs/>
+          <w:sz w:val="32"/>
+          <w:szCs w:val="32"/>
+          <w:u w:val="single"/>
+        </w:rPr>
+      </w:pPr>
+    </w:p>
+    <w:p>
+      <w:pPr>
+        <w:jc w:val="center"/>
+        <w:rPr>
+          <w:b/>
+          <w:bCs/>
+          <w:sz w:val="32"/>
+          <w:szCs w:val="32"/>
+          <w:u w:val="single"/>
+        </w:rPr>
+      </w:pPr>
+    </w:p>
+    <w:p>
+      <w:pPr>
+        <w:jc w:val="center"/>
+        <w:rPr>
+          <w:b/>
+          <w:bCs/>
+          <w:sz w:val="32"/>
+          <w:szCs w:val="32"/>
+          <w:u w:val="single"/>
+        </w:rPr>
+      </w:pPr>
     </w:p>
     <w:p>
       <w:pPr>
@@ -2597,6 +3845,7 @@
           <w:szCs w:val="32"/>
           <w:u w:val="single"/>
         </w:rPr>
+        <w:lastRenderedPageBreak/>
         <w:t xml:space="preserve">TS </w:t>
       </w:r>
       <w:r>
@@ -2745,12 +3994,16 @@
               <w:spacing w:before="0" w:line="240" w:lineRule="auto"/>
               <w:jc w:val="center"/>
               <w:rPr>
-                <w:sz w:val="32"/>
-                <w:szCs w:val="32"/>
-              </w:rPr>
-            </w:pPr>
-            <w:r>
-              <w:rPr>
+                <w:b/>
+                <w:bCs/>
+                <w:sz w:val="32"/>
+                <w:szCs w:val="32"/>
+              </w:rPr>
+            </w:pPr>
+            <w:r>
+              <w:rPr>
+                <w:b/>
+                <w:bCs/>
                 <w:sz w:val="32"/>
                 <w:szCs w:val="32"/>
               </w:rPr>
@@ -2762,12 +4015,16 @@
               <w:spacing w:before="0" w:line="240" w:lineRule="auto"/>
               <w:jc w:val="center"/>
               <w:rPr>
-                <w:sz w:val="32"/>
-                <w:szCs w:val="32"/>
-              </w:rPr>
-            </w:pPr>
-            <w:r>
-              <w:rPr>
+                <w:b/>
+                <w:bCs/>
+                <w:sz w:val="32"/>
+                <w:szCs w:val="32"/>
+              </w:rPr>
+            </w:pPr>
+            <w:r>
+              <w:rPr>
+                <w:b/>
+                <w:bCs/>
                 <w:sz w:val="32"/>
                 <w:szCs w:val="32"/>
               </w:rPr>
@@ -2784,12 +4041,16 @@
               <w:spacing w:before="0" w:line="240" w:lineRule="auto"/>
               <w:jc w:val="center"/>
               <w:rPr>
-                <w:sz w:val="32"/>
-                <w:szCs w:val="32"/>
-              </w:rPr>
-            </w:pPr>
-            <w:r>
-              <w:rPr>
+                <w:b/>
+                <w:bCs/>
+                <w:sz w:val="32"/>
+                <w:szCs w:val="32"/>
+              </w:rPr>
+            </w:pPr>
+            <w:r>
+              <w:rPr>
+                <w:b/>
+                <w:bCs/>
                 <w:sz w:val="32"/>
                 <w:szCs w:val="32"/>
               </w:rPr>
@@ -2807,12 +4068,16 @@
               <w:ind w:right="-18"/>
               <w:jc w:val="center"/>
               <w:rPr>
-                <w:sz w:val="32"/>
-                <w:szCs w:val="32"/>
-              </w:rPr>
-            </w:pPr>
-            <w:r>
-              <w:rPr>
+                <w:b/>
+                <w:bCs/>
+                <w:sz w:val="32"/>
+                <w:szCs w:val="32"/>
+              </w:rPr>
+            </w:pPr>
+            <w:r>
+              <w:rPr>
+                <w:b/>
+                <w:bCs/>
                 <w:sz w:val="32"/>
                 <w:szCs w:val="32"/>
               </w:rPr>
@@ -4145,7 +5410,6 @@
                 <w:sz w:val="28"/>
                 <w:szCs w:val="32"/>
               </w:rPr>
-              <w:lastRenderedPageBreak/>
               <w:t>T.S.6.2.3.1 – Kramam</w:t>
             </w:r>
           </w:p>
@@ -4758,6 +6022,7 @@
                 <w:sz w:val="28"/>
                 <w:szCs w:val="32"/>
               </w:rPr>
+              <w:lastRenderedPageBreak/>
               <w:t>T.S.6.2.3.3 – Kramam</w:t>
             </w:r>
           </w:p>
@@ -5302,17 +6567,7 @@
                 <w:sz w:val="40"/>
                 <w:szCs w:val="40"/>
               </w:rPr>
-              <w:t xml:space="preserve">ëÉiÉ×þurÉÉlÉç </w:t>
-            </w:r>
-            <w:proofErr w:type="gramStart"/>
-            <w:r>
-              <w:rPr>
-                <w:rFonts w:ascii="BRH Devanagari Extra" w:hAnsi="BRH Devanagari Extra" w:cs="BRH Devanagari Extra"/>
-                <w:color w:val="000000"/>
-                <w:sz w:val="40"/>
-                <w:szCs w:val="40"/>
-              </w:rPr>
-              <w:t xml:space="preserve">| </w:t>
+              <w:t xml:space="preserve">ëÉiÉ×þurÉÉlÉç | </w:t>
             </w:r>
             <w:r>
               <w:rPr>
@@ -5324,7 +6579,6 @@
               </w:rPr>
               <w:t xml:space="preserve"> (</w:t>
             </w:r>
-            <w:proofErr w:type="gramEnd"/>
             <w:r>
               <w:rPr>
                 <w:b/>
@@ -5399,31 +6653,22 @@
                 <w:b/>
                 <w:bCs/>
               </w:rPr>
-              <w:t xml:space="preserve">Separator </w:t>
-            </w:r>
-            <w:proofErr w:type="gramStart"/>
+              <w:t>Separator removed</w:t>
+            </w:r>
             <w:r>
               <w:rPr>
                 <w:b/>
                 <w:bCs/>
               </w:rPr>
-              <w:t>removed</w:t>
+              <w:t xml:space="preserve"> </w:t>
             </w:r>
             <w:r>
               <w:rPr>
                 <w:b/>
                 <w:bCs/>
               </w:rPr>
-              <w:t xml:space="preserve"> </w:t>
-            </w:r>
-            <w:r>
-              <w:rPr>
-                <w:b/>
-                <w:bCs/>
-              </w:rPr>
               <w:t>)</w:t>
             </w:r>
-            <w:proofErr w:type="gramEnd"/>
           </w:p>
         </w:tc>
       </w:tr>
@@ -6063,7 +7308,6 @@
                 <w:sz w:val="28"/>
                 <w:szCs w:val="32"/>
               </w:rPr>
-              <w:lastRenderedPageBreak/>
               <w:t>T.S.6.2.4.5 – Kramam</w:t>
             </w:r>
           </w:p>
@@ -6839,6 +8083,7 @@
                 <w:sz w:val="28"/>
                 <w:szCs w:val="32"/>
               </w:rPr>
+              <w:lastRenderedPageBreak/>
               <w:t>T.S.6.2.6.3 – Kramam</w:t>
             </w:r>
           </w:p>
@@ -7914,7 +9159,6 @@
                 <w:sz w:val="28"/>
                 <w:szCs w:val="32"/>
               </w:rPr>
-              <w:lastRenderedPageBreak/>
               <w:t>T.S.6.2.8.5 – Kramam</w:t>
             </w:r>
           </w:p>
@@ -8864,6 +10108,7 @@
                 <w:sz w:val="40"/>
                 <w:szCs w:val="40"/>
               </w:rPr>
+              <w:lastRenderedPageBreak/>
               <w:t>S</w:t>
             </w:r>
             <w:r>
@@ -8926,6 +10171,7 @@
                 <w:sz w:val="40"/>
                 <w:szCs w:val="40"/>
               </w:rPr>
+              <w:lastRenderedPageBreak/>
               <w:t>AuÉþ ÂlkÉå | Â</w:t>
             </w:r>
             <w:r>
@@ -9010,6 +10256,7 @@
                 <w:sz w:val="40"/>
                 <w:szCs w:val="40"/>
               </w:rPr>
+              <w:lastRenderedPageBreak/>
               <w:t>S</w:t>
             </w:r>
             <w:r>
@@ -9095,6 +10342,7 @@
                 <w:sz w:val="28"/>
                 <w:szCs w:val="32"/>
               </w:rPr>
+              <w:lastRenderedPageBreak/>
               <w:t>T.S.6.2.11.3 – Kramam</w:t>
             </w:r>
           </w:p>
@@ -9452,16 +10700,7 @@
           <w:bCs/>
           <w:sz w:val="32"/>
         </w:rPr>
-        <w:t xml:space="preserve">replaced </w:t>
-      </w:r>
-      <w:proofErr w:type="gramStart"/>
-      <w:r>
-        <w:rPr>
-          <w:b/>
-          <w:bCs/>
-          <w:sz w:val="32"/>
-        </w:rPr>
-        <w:t>with</w:t>
+        <w:t>replaced with</w:t>
       </w:r>
       <w:r>
         <w:rPr>
@@ -9483,7 +10722,6 @@
         </w:rPr>
         <w:t>"</w:t>
       </w:r>
-      <w:proofErr w:type="gramEnd"/>
       <w:r>
         <w:rPr>
           <w:rFonts w:ascii="BRH Devanagari" w:hAnsi="BRH Devanagari" w:cs="BRH Devanagari"/>
@@ -9547,54 +10785,6 @@
           <w:u w:val="single"/>
         </w:rPr>
       </w:pPr>
-    </w:p>
-    <w:p>
-      <w:pPr>
-        <w:jc w:val="center"/>
-        <w:rPr>
-          <w:b/>
-          <w:bCs/>
-          <w:sz w:val="32"/>
-          <w:szCs w:val="32"/>
-          <w:u w:val="single"/>
-        </w:rPr>
-      </w:pPr>
-    </w:p>
-    <w:p>
-      <w:pPr>
-        <w:jc w:val="center"/>
-        <w:rPr>
-          <w:b/>
-          <w:bCs/>
-          <w:sz w:val="32"/>
-          <w:szCs w:val="32"/>
-          <w:u w:val="single"/>
-        </w:rPr>
-      </w:pPr>
-    </w:p>
-    <w:p>
-      <w:pPr>
-        <w:jc w:val="center"/>
-        <w:rPr>
-          <w:b/>
-          <w:bCs/>
-          <w:sz w:val="32"/>
-          <w:szCs w:val="32"/>
-          <w:u w:val="single"/>
-        </w:rPr>
-      </w:pPr>
-    </w:p>
-    <w:p>
-      <w:pPr>
-        <w:jc w:val="center"/>
-        <w:rPr>
-          <w:b/>
-          <w:bCs/>
-          <w:sz w:val="32"/>
-          <w:szCs w:val="32"/>
-          <w:u w:val="single"/>
-        </w:rPr>
-      </w:pPr>
       <w:r>
         <w:rPr>
           <w:b/>
@@ -9603,7 +10793,6 @@
           <w:szCs w:val="32"/>
           <w:u w:val="single"/>
         </w:rPr>
-        <w:lastRenderedPageBreak/>
         <w:t xml:space="preserve">TS </w:t>
       </w:r>
       <w:r>
@@ -9923,7 +11112,7 @@
 </file>
 
 <file path=word/endnotes.xml><?xml version="1.0" encoding="utf-8"?>
-<w:endnotes xmlns:wpc="http://schemas.microsoft.com/office/word/2010/wordprocessingCanvas" xmlns:cx="http://schemas.microsoft.com/office/drawing/2014/chartex" xmlns:cx1="http://schemas.microsoft.com/office/drawing/2015/9/8/chartex" xmlns:cx2="http://schemas.microsoft.com/office/drawing/2015/10/21/chartex" xmlns:cx3="http://schemas.microsoft.com/office/drawing/2016/5/9/chartex" xmlns:cx4="http://schemas.microsoft.com/office/drawing/2016/5/10/chartex" xmlns:cx5="http://schemas.microsoft.com/office/drawing/2016/5/11/chartex" xmlns:cx6="http://schemas.microsoft.com/office/drawing/2016/5/12/chartex" xmlns:cx7="http://schemas.microsoft.com/office/drawing/2016/5/13/chartex" xmlns:cx8="http://schemas.microsoft.com/office/drawing/2016/5/14/chartex" xmlns:mc="http://schemas.openxmlformats.org/markup-compatibility/2006" xmlns:aink="http://schemas.microsoft.com/office/drawing/2016/ink" xmlns:am3d="http://schemas.microsoft.com/office/drawing/2017/model3d" xmlns:o="urn:schemas-microsoft-com:office:office" xmlns:oel="http://schemas.microsoft.com/office/2019/extlst" xmlns:r="http://schemas.openxmlformats.org/officeDocument/2006/relationships" xmlns:m="http://schemas.openxmlformats.org/officeDocument/2006/math" xmlns:v="urn:schemas-microsoft-com:vml" xmlns:wp14="http://schemas.microsoft.com/office/word/2010/wordprocessingDrawing" xmlns:wp="http://schemas.openxmlformats.org/drawingml/2006/wordprocessingDrawing" xmlns:w10="urn:schemas-microsoft-com:office:word" xmlns:w="http://schemas.openxmlformats.org/wordprocessingml/2006/main" xmlns:w14="http://schemas.microsoft.com/office/word/2010/wordml" xmlns:w15="http://schemas.microsoft.com/office/word/2012/wordml" xmlns:w16cei="http://schemas.microsoft.com/office/word/2026/wordml/cei" xmlns:w16cex="http://schemas.microsoft.com/office/word/2018/wordml/cex" xmlns:w16cid="http://schemas.microsoft.com/office/word/2016/wordml/cid" xmlns:w16="http://schemas.microsoft.com/office/word/2018/wordml" xmlns:w16du="http://schemas.microsoft.com/office/word/2023/wordml/word16du" xmlns:w16sdtdh="http://schemas.microsoft.com/office/word/2020/wordml/sdtdatahash" xmlns:w16sdtfl="http://schemas.microsoft.com/office/word/2024/wordml/sdtformatlock" xmlns:w16se="http://schemas.microsoft.com/office/word/2015/wordml/symex" xmlns:wpg="http://schemas.microsoft.com/office/word/2010/wordprocessingGroup" xmlns:wpi="http://schemas.microsoft.com/office/word/2010/wordprocessingInk" xmlns:wne="http://schemas.microsoft.com/office/word/2006/wordml" xmlns:wps="http://schemas.microsoft.com/office/word/2010/wordprocessingShape" mc:Ignorable="w14 w15 w16se w16cid w16 w16cex w16sdtdh w16sdtfl w16du wp14">
+<w:endnotes xmlns:wpc="http://schemas.microsoft.com/office/word/2010/wordprocessingCanvas" xmlns:cx="http://schemas.microsoft.com/office/drawing/2014/chartex" xmlns:cx1="http://schemas.microsoft.com/office/drawing/2015/9/8/chartex" xmlns:cx2="http://schemas.microsoft.com/office/drawing/2015/10/21/chartex" xmlns:cx3="http://schemas.microsoft.com/office/drawing/2016/5/9/chartex" xmlns:cx4="http://schemas.microsoft.com/office/drawing/2016/5/10/chartex" xmlns:cx5="http://schemas.microsoft.com/office/drawing/2016/5/11/chartex" xmlns:cx6="http://schemas.microsoft.com/office/drawing/2016/5/12/chartex" xmlns:cx7="http://schemas.microsoft.com/office/drawing/2016/5/13/chartex" xmlns:cx8="http://schemas.microsoft.com/office/drawing/2016/5/14/chartex" xmlns:mc="http://schemas.openxmlformats.org/markup-compatibility/2006" xmlns:aink="http://schemas.microsoft.com/office/drawing/2016/ink" xmlns:am3d="http://schemas.microsoft.com/office/drawing/2017/model3d" xmlns:o="urn:schemas-microsoft-com:office:office" xmlns:oel="http://schemas.microsoft.com/office/2019/extlst" xmlns:r="http://schemas.openxmlformats.org/officeDocument/2006/relationships" xmlns:m="http://schemas.openxmlformats.org/officeDocument/2006/math" xmlns:v="urn:schemas-microsoft-com:vml" xmlns:wp14="http://schemas.microsoft.com/office/word/2010/wordprocessingDrawing" xmlns:wp="http://schemas.openxmlformats.org/drawingml/2006/wordprocessingDrawing" xmlns:w10="urn:schemas-microsoft-com:office:word" xmlns:w="http://schemas.openxmlformats.org/wordprocessingml/2006/main" xmlns:w14="http://schemas.microsoft.com/office/word/2010/wordml" xmlns:w15="http://schemas.microsoft.com/office/word/2012/wordml" xmlns:w16cex="http://schemas.microsoft.com/office/word/2018/wordml/cex" xmlns:w16cid="http://schemas.microsoft.com/office/word/2016/wordml/cid" xmlns:w16="http://schemas.microsoft.com/office/word/2018/wordml" xmlns:w16du="http://schemas.microsoft.com/office/word/2023/wordml/word16du" xmlns:w16sdtdh="http://schemas.microsoft.com/office/word/2020/wordml/sdtdatahash" xmlns:w16sdtfl="http://schemas.microsoft.com/office/word/2024/wordml/sdtformatlock" xmlns:w16se="http://schemas.microsoft.com/office/word/2015/wordml/symex" xmlns:wpg="http://schemas.microsoft.com/office/word/2010/wordprocessingGroup" xmlns:wpi="http://schemas.microsoft.com/office/word/2010/wordprocessingInk" xmlns:wne="http://schemas.microsoft.com/office/word/2006/wordml" xmlns:wps="http://schemas.microsoft.com/office/word/2010/wordprocessingShape" mc:Ignorable="w14 w15 w16se w16cid w16 w16cex w16sdtdh w16sdtfl w16du wp14">
   <w:endnote w:type="separator" w:id="-1">
     <w:p>
       <w:pPr>
@@ -9948,7 +11137,7 @@
 </file>
 
 <file path=word/footer1.xml><?xml version="1.0" encoding="utf-8"?>
-<w:ftr xmlns:wpc="http://schemas.microsoft.com/office/word/2010/wordprocessingCanvas" xmlns:cx="http://schemas.microsoft.com/office/drawing/2014/chartex" xmlns:cx1="http://schemas.microsoft.com/office/drawing/2015/9/8/chartex" xmlns:cx2="http://schemas.microsoft.com/office/drawing/2015/10/21/chartex" xmlns:cx3="http://schemas.microsoft.com/office/drawing/2016/5/9/chartex" xmlns:cx4="http://schemas.microsoft.com/office/drawing/2016/5/10/chartex" xmlns:cx5="http://schemas.microsoft.com/office/drawing/2016/5/11/chartex" xmlns:cx6="http://schemas.microsoft.com/office/drawing/2016/5/12/chartex" xmlns:cx7="http://schemas.microsoft.com/office/drawing/2016/5/13/chartex" xmlns:cx8="http://schemas.microsoft.com/office/drawing/2016/5/14/chartex" xmlns:mc="http://schemas.openxmlformats.org/markup-compatibility/2006" xmlns:aink="http://schemas.microsoft.com/office/drawing/2016/ink" xmlns:am3d="http://schemas.microsoft.com/office/drawing/2017/model3d" xmlns:o="urn:schemas-microsoft-com:office:office" xmlns:oel="http://schemas.microsoft.com/office/2019/extlst" xmlns:r="http://schemas.openxmlformats.org/officeDocument/2006/relationships" xmlns:m="http://schemas.openxmlformats.org/officeDocument/2006/math" xmlns:v="urn:schemas-microsoft-com:vml" xmlns:wp14="http://schemas.microsoft.com/office/word/2010/wordprocessingDrawing" xmlns:wp="http://schemas.openxmlformats.org/drawingml/2006/wordprocessingDrawing" xmlns:w10="urn:schemas-microsoft-com:office:word" xmlns:w="http://schemas.openxmlformats.org/wordprocessingml/2006/main" xmlns:w14="http://schemas.microsoft.com/office/word/2010/wordml" xmlns:w15="http://schemas.microsoft.com/office/word/2012/wordml" xmlns:w16cei="http://schemas.microsoft.com/office/word/2026/wordml/cei" xmlns:w16cex="http://schemas.microsoft.com/office/word/2018/wordml/cex" xmlns:w16cid="http://schemas.microsoft.com/office/word/2016/wordml/cid" xmlns:w16="http://schemas.microsoft.com/office/word/2018/wordml" xmlns:w16du="http://schemas.microsoft.com/office/word/2023/wordml/word16du" xmlns:w16sdtdh="http://schemas.microsoft.com/office/word/2020/wordml/sdtdatahash" xmlns:w16sdtfl="http://schemas.microsoft.com/office/word/2024/wordml/sdtformatlock" xmlns:w16se="http://schemas.microsoft.com/office/word/2015/wordml/symex" xmlns:wpg="http://schemas.microsoft.com/office/word/2010/wordprocessingGroup" xmlns:wpi="http://schemas.microsoft.com/office/word/2010/wordprocessingInk" xmlns:wne="http://schemas.microsoft.com/office/word/2006/wordml" xmlns:wps="http://schemas.microsoft.com/office/word/2010/wordprocessingShape" mc:Ignorable="w14 w15 w16se w16cid w16 w16cex w16sdtdh w16sdtfl w16du wp14">
+<w:ftr xmlns:wpc="http://schemas.microsoft.com/office/word/2010/wordprocessingCanvas" xmlns:cx="http://schemas.microsoft.com/office/drawing/2014/chartex" xmlns:cx1="http://schemas.microsoft.com/office/drawing/2015/9/8/chartex" xmlns:cx2="http://schemas.microsoft.com/office/drawing/2015/10/21/chartex" xmlns:cx3="http://schemas.microsoft.com/office/drawing/2016/5/9/chartex" xmlns:cx4="http://schemas.microsoft.com/office/drawing/2016/5/10/chartex" xmlns:cx5="http://schemas.microsoft.com/office/drawing/2016/5/11/chartex" xmlns:cx6="http://schemas.microsoft.com/office/drawing/2016/5/12/chartex" xmlns:cx7="http://schemas.microsoft.com/office/drawing/2016/5/13/chartex" xmlns:cx8="http://schemas.microsoft.com/office/drawing/2016/5/14/chartex" xmlns:mc="http://schemas.openxmlformats.org/markup-compatibility/2006" xmlns:aink="http://schemas.microsoft.com/office/drawing/2016/ink" xmlns:am3d="http://schemas.microsoft.com/office/drawing/2017/model3d" xmlns:o="urn:schemas-microsoft-com:office:office" xmlns:oel="http://schemas.microsoft.com/office/2019/extlst" xmlns:r="http://schemas.openxmlformats.org/officeDocument/2006/relationships" xmlns:m="http://schemas.openxmlformats.org/officeDocument/2006/math" xmlns:v="urn:schemas-microsoft-com:vml" xmlns:wp14="http://schemas.microsoft.com/office/word/2010/wordprocessingDrawing" xmlns:wp="http://schemas.openxmlformats.org/drawingml/2006/wordprocessingDrawing" xmlns:w10="urn:schemas-microsoft-com:office:word" xmlns:w="http://schemas.openxmlformats.org/wordprocessingml/2006/main" xmlns:w14="http://schemas.microsoft.com/office/word/2010/wordml" xmlns:w15="http://schemas.microsoft.com/office/word/2012/wordml" xmlns:w16cex="http://schemas.microsoft.com/office/word/2018/wordml/cex" xmlns:w16cid="http://schemas.microsoft.com/office/word/2016/wordml/cid" xmlns:w16="http://schemas.microsoft.com/office/word/2018/wordml" xmlns:w16du="http://schemas.microsoft.com/office/word/2023/wordml/word16du" xmlns:w16sdtdh="http://schemas.microsoft.com/office/word/2020/wordml/sdtdatahash" xmlns:w16sdtfl="http://schemas.microsoft.com/office/word/2024/wordml/sdtformatlock" xmlns:w16se="http://schemas.microsoft.com/office/word/2015/wordml/symex" xmlns:wpg="http://schemas.microsoft.com/office/word/2010/wordprocessingGroup" xmlns:wpi="http://schemas.microsoft.com/office/word/2010/wordprocessingInk" xmlns:wne="http://schemas.microsoft.com/office/word/2006/wordml" xmlns:wps="http://schemas.microsoft.com/office/word/2010/wordprocessingShape" mc:Ignorable="w14 w15 w16se w16cid w16 w16cex w16sdtdh w16sdtfl w16du wp14">
   <w:p>
     <w:pPr>
       <w:pBdr>
@@ -10001,14 +11190,35 @@
         <w:bCs/>
       </w:rPr>
       <w:tab/>
-      <w:t xml:space="preserve">              v</w:t>
+      <w:t xml:space="preserve">             </w:t>
     </w:r>
     <w:r>
       <w:rPr>
         <w:b/>
         <w:bCs/>
       </w:rPr>
-      <w:t>edavms@gmail.com</w:t>
+      <w:t>www.</w:t>
+    </w:r>
+    <w:r>
+      <w:rPr>
+        <w:b/>
+        <w:bCs/>
+      </w:rPr>
+      <w:t>v</w:t>
+    </w:r>
+    <w:r>
+      <w:rPr>
+        <w:b/>
+        <w:bCs/>
+      </w:rPr>
+      <w:t>edavms</w:t>
+    </w:r>
+    <w:r>
+      <w:rPr>
+        <w:b/>
+        <w:bCs/>
+      </w:rPr>
+      <w:t>.in</w:t>
     </w:r>
     <w:r>
       <w:rPr>
@@ -10027,6 +11237,9 @@
     </w:r>
     <w:r>
       <w:tab/>
+    </w:r>
+    <w:r>
+      <w:t xml:space="preserve">                       </w:t>
     </w:r>
     <w:r>
       <w:tab/>
@@ -10130,7 +11343,7 @@
 </file>
 
 <file path=word/footer2.xml><?xml version="1.0" encoding="utf-8"?>
-<w:ftr xmlns:wpc="http://schemas.microsoft.com/office/word/2010/wordprocessingCanvas" xmlns:cx="http://schemas.microsoft.com/office/drawing/2014/chartex" xmlns:cx1="http://schemas.microsoft.com/office/drawing/2015/9/8/chartex" xmlns:cx2="http://schemas.microsoft.com/office/drawing/2015/10/21/chartex" xmlns:cx3="http://schemas.microsoft.com/office/drawing/2016/5/9/chartex" xmlns:cx4="http://schemas.microsoft.com/office/drawing/2016/5/10/chartex" xmlns:cx5="http://schemas.microsoft.com/office/drawing/2016/5/11/chartex" xmlns:cx6="http://schemas.microsoft.com/office/drawing/2016/5/12/chartex" xmlns:cx7="http://schemas.microsoft.com/office/drawing/2016/5/13/chartex" xmlns:cx8="http://schemas.microsoft.com/office/drawing/2016/5/14/chartex" xmlns:mc="http://schemas.openxmlformats.org/markup-compatibility/2006" xmlns:aink="http://schemas.microsoft.com/office/drawing/2016/ink" xmlns:am3d="http://schemas.microsoft.com/office/drawing/2017/model3d" xmlns:o="urn:schemas-microsoft-com:office:office" xmlns:oel="http://schemas.microsoft.com/office/2019/extlst" xmlns:r="http://schemas.openxmlformats.org/officeDocument/2006/relationships" xmlns:m="http://schemas.openxmlformats.org/officeDocument/2006/math" xmlns:v="urn:schemas-microsoft-com:vml" xmlns:wp14="http://schemas.microsoft.com/office/word/2010/wordprocessingDrawing" xmlns:wp="http://schemas.openxmlformats.org/drawingml/2006/wordprocessingDrawing" xmlns:w10="urn:schemas-microsoft-com:office:word" xmlns:w="http://schemas.openxmlformats.org/wordprocessingml/2006/main" xmlns:w14="http://schemas.microsoft.com/office/word/2010/wordml" xmlns:w15="http://schemas.microsoft.com/office/word/2012/wordml" xmlns:w16cei="http://schemas.microsoft.com/office/word/2026/wordml/cei" xmlns:w16cex="http://schemas.microsoft.com/office/word/2018/wordml/cex" xmlns:w16cid="http://schemas.microsoft.com/office/word/2016/wordml/cid" xmlns:w16="http://schemas.microsoft.com/office/word/2018/wordml" xmlns:w16du="http://schemas.microsoft.com/office/word/2023/wordml/word16du" xmlns:w16sdtdh="http://schemas.microsoft.com/office/word/2020/wordml/sdtdatahash" xmlns:w16sdtfl="http://schemas.microsoft.com/office/word/2024/wordml/sdtformatlock" xmlns:w16se="http://schemas.microsoft.com/office/word/2015/wordml/symex" xmlns:wpg="http://schemas.microsoft.com/office/word/2010/wordprocessingGroup" xmlns:wpi="http://schemas.microsoft.com/office/word/2010/wordprocessingInk" xmlns:wne="http://schemas.microsoft.com/office/word/2006/wordml" xmlns:wps="http://schemas.microsoft.com/office/word/2010/wordprocessingShape" mc:Ignorable="w14 w15 w16se w16cid w16 w16cex w16sdtdh w16sdtfl w16du wp14">
+<w:ftr xmlns:wpc="http://schemas.microsoft.com/office/word/2010/wordprocessingCanvas" xmlns:cx="http://schemas.microsoft.com/office/drawing/2014/chartex" xmlns:cx1="http://schemas.microsoft.com/office/drawing/2015/9/8/chartex" xmlns:cx2="http://schemas.microsoft.com/office/drawing/2015/10/21/chartex" xmlns:cx3="http://schemas.microsoft.com/office/drawing/2016/5/9/chartex" xmlns:cx4="http://schemas.microsoft.com/office/drawing/2016/5/10/chartex" xmlns:cx5="http://schemas.microsoft.com/office/drawing/2016/5/11/chartex" xmlns:cx6="http://schemas.microsoft.com/office/drawing/2016/5/12/chartex" xmlns:cx7="http://schemas.microsoft.com/office/drawing/2016/5/13/chartex" xmlns:cx8="http://schemas.microsoft.com/office/drawing/2016/5/14/chartex" xmlns:mc="http://schemas.openxmlformats.org/markup-compatibility/2006" xmlns:aink="http://schemas.microsoft.com/office/drawing/2016/ink" xmlns:am3d="http://schemas.microsoft.com/office/drawing/2017/model3d" xmlns:o="urn:schemas-microsoft-com:office:office" xmlns:oel="http://schemas.microsoft.com/office/2019/extlst" xmlns:r="http://schemas.openxmlformats.org/officeDocument/2006/relationships" xmlns:m="http://schemas.openxmlformats.org/officeDocument/2006/math" xmlns:v="urn:schemas-microsoft-com:vml" xmlns:wp14="http://schemas.microsoft.com/office/word/2010/wordprocessingDrawing" xmlns:wp="http://schemas.openxmlformats.org/drawingml/2006/wordprocessingDrawing" xmlns:w10="urn:schemas-microsoft-com:office:word" xmlns:w="http://schemas.openxmlformats.org/wordprocessingml/2006/main" xmlns:w14="http://schemas.microsoft.com/office/word/2010/wordml" xmlns:w15="http://schemas.microsoft.com/office/word/2012/wordml" xmlns:w16cex="http://schemas.microsoft.com/office/word/2018/wordml/cex" xmlns:w16cid="http://schemas.microsoft.com/office/word/2016/wordml/cid" xmlns:w16="http://schemas.microsoft.com/office/word/2018/wordml" xmlns:w16du="http://schemas.microsoft.com/office/word/2023/wordml/word16du" xmlns:w16sdtdh="http://schemas.microsoft.com/office/word/2020/wordml/sdtdatahash" xmlns:w16sdtfl="http://schemas.microsoft.com/office/word/2024/wordml/sdtformatlock" xmlns:w16se="http://schemas.microsoft.com/office/word/2015/wordml/symex" xmlns:wpg="http://schemas.microsoft.com/office/word/2010/wordprocessingGroup" xmlns:wpi="http://schemas.microsoft.com/office/word/2010/wordprocessingInk" xmlns:wne="http://schemas.microsoft.com/office/word/2006/wordml" xmlns:wps="http://schemas.microsoft.com/office/word/2010/wordprocessingShape" mc:Ignorable="w14 w15 w16se w16cid w16 w16cex w16sdtdh w16sdtfl w16du wp14">
   <w:p>
     <w:pPr>
       <w:pBdr>
@@ -10218,6 +11431,19 @@
         <w:bCs/>
       </w:rPr>
       <w:tab/>
+    </w:r>
+    <w:r>
+      <w:rPr>
+        <w:b/>
+        <w:bCs/>
+      </w:rPr>
+      <w:t xml:space="preserve">           </w:t>
+    </w:r>
+    <w:r>
+      <w:rPr>
+        <w:b/>
+        <w:bCs/>
+      </w:rPr>
       <w:t xml:space="preserve"> </w:t>
     </w:r>
     <w:r>
@@ -10333,7 +11559,7 @@
 </file>
 
 <file path=word/footnotes.xml><?xml version="1.0" encoding="utf-8"?>
-<w:footnotes xmlns:wpc="http://schemas.microsoft.com/office/word/2010/wordprocessingCanvas" xmlns:cx="http://schemas.microsoft.com/office/drawing/2014/chartex" xmlns:cx1="http://schemas.microsoft.com/office/drawing/2015/9/8/chartex" xmlns:cx2="http://schemas.microsoft.com/office/drawing/2015/10/21/chartex" xmlns:cx3="http://schemas.microsoft.com/office/drawing/2016/5/9/chartex" xmlns:cx4="http://schemas.microsoft.com/office/drawing/2016/5/10/chartex" xmlns:cx5="http://schemas.microsoft.com/office/drawing/2016/5/11/chartex" xmlns:cx6="http://schemas.microsoft.com/office/drawing/2016/5/12/chartex" xmlns:cx7="http://schemas.microsoft.com/office/drawing/2016/5/13/chartex" xmlns:cx8="http://schemas.microsoft.com/office/drawing/2016/5/14/chartex" xmlns:mc="http://schemas.openxmlformats.org/markup-compatibility/2006" xmlns:aink="http://schemas.microsoft.com/office/drawing/2016/ink" xmlns:am3d="http://schemas.microsoft.com/office/drawing/2017/model3d" xmlns:o="urn:schemas-microsoft-com:office:office" xmlns:oel="http://schemas.microsoft.com/office/2019/extlst" xmlns:r="http://schemas.openxmlformats.org/officeDocument/2006/relationships" xmlns:m="http://schemas.openxmlformats.org/officeDocument/2006/math" xmlns:v="urn:schemas-microsoft-com:vml" xmlns:wp14="http://schemas.microsoft.com/office/word/2010/wordprocessingDrawing" xmlns:wp="http://schemas.openxmlformats.org/drawingml/2006/wordprocessingDrawing" xmlns:w10="urn:schemas-microsoft-com:office:word" xmlns:w="http://schemas.openxmlformats.org/wordprocessingml/2006/main" xmlns:w14="http://schemas.microsoft.com/office/word/2010/wordml" xmlns:w15="http://schemas.microsoft.com/office/word/2012/wordml" xmlns:w16cei="http://schemas.microsoft.com/office/word/2026/wordml/cei" xmlns:w16cex="http://schemas.microsoft.com/office/word/2018/wordml/cex" xmlns:w16cid="http://schemas.microsoft.com/office/word/2016/wordml/cid" xmlns:w16="http://schemas.microsoft.com/office/word/2018/wordml" xmlns:w16du="http://schemas.microsoft.com/office/word/2023/wordml/word16du" xmlns:w16sdtdh="http://schemas.microsoft.com/office/word/2020/wordml/sdtdatahash" xmlns:w16sdtfl="http://schemas.microsoft.com/office/word/2024/wordml/sdtformatlock" xmlns:w16se="http://schemas.microsoft.com/office/word/2015/wordml/symex" xmlns:wpg="http://schemas.microsoft.com/office/word/2010/wordprocessingGroup" xmlns:wpi="http://schemas.microsoft.com/office/word/2010/wordprocessingInk" xmlns:wne="http://schemas.microsoft.com/office/word/2006/wordml" xmlns:wps="http://schemas.microsoft.com/office/word/2010/wordprocessingShape" mc:Ignorable="w14 w15 w16se w16cid w16 w16cex w16sdtdh w16sdtfl w16du wp14">
+<w:footnotes xmlns:wpc="http://schemas.microsoft.com/office/word/2010/wordprocessingCanvas" xmlns:cx="http://schemas.microsoft.com/office/drawing/2014/chartex" xmlns:cx1="http://schemas.microsoft.com/office/drawing/2015/9/8/chartex" xmlns:cx2="http://schemas.microsoft.com/office/drawing/2015/10/21/chartex" xmlns:cx3="http://schemas.microsoft.com/office/drawing/2016/5/9/chartex" xmlns:cx4="http://schemas.microsoft.com/office/drawing/2016/5/10/chartex" xmlns:cx5="http://schemas.microsoft.com/office/drawing/2016/5/11/chartex" xmlns:cx6="http://schemas.microsoft.com/office/drawing/2016/5/12/chartex" xmlns:cx7="http://schemas.microsoft.com/office/drawing/2016/5/13/chartex" xmlns:cx8="http://schemas.microsoft.com/office/drawing/2016/5/14/chartex" xmlns:mc="http://schemas.openxmlformats.org/markup-compatibility/2006" xmlns:aink="http://schemas.microsoft.com/office/drawing/2016/ink" xmlns:am3d="http://schemas.microsoft.com/office/drawing/2017/model3d" xmlns:o="urn:schemas-microsoft-com:office:office" xmlns:oel="http://schemas.microsoft.com/office/2019/extlst" xmlns:r="http://schemas.openxmlformats.org/officeDocument/2006/relationships" xmlns:m="http://schemas.openxmlformats.org/officeDocument/2006/math" xmlns:v="urn:schemas-microsoft-com:vml" xmlns:wp14="http://schemas.microsoft.com/office/word/2010/wordprocessingDrawing" xmlns:wp="http://schemas.openxmlformats.org/drawingml/2006/wordprocessingDrawing" xmlns:w10="urn:schemas-microsoft-com:office:word" xmlns:w="http://schemas.openxmlformats.org/wordprocessingml/2006/main" xmlns:w14="http://schemas.microsoft.com/office/word/2010/wordml" xmlns:w15="http://schemas.microsoft.com/office/word/2012/wordml" xmlns:w16cex="http://schemas.microsoft.com/office/word/2018/wordml/cex" xmlns:w16cid="http://schemas.microsoft.com/office/word/2016/wordml/cid" xmlns:w16="http://schemas.microsoft.com/office/word/2018/wordml" xmlns:w16du="http://schemas.microsoft.com/office/word/2023/wordml/word16du" xmlns:w16sdtdh="http://schemas.microsoft.com/office/word/2020/wordml/sdtdatahash" xmlns:w16sdtfl="http://schemas.microsoft.com/office/word/2024/wordml/sdtformatlock" xmlns:w16se="http://schemas.microsoft.com/office/word/2015/wordml/symex" xmlns:wpg="http://schemas.microsoft.com/office/word/2010/wordprocessingGroup" xmlns:wpi="http://schemas.microsoft.com/office/word/2010/wordprocessingInk" xmlns:wne="http://schemas.microsoft.com/office/word/2006/wordml" xmlns:wps="http://schemas.microsoft.com/office/word/2010/wordprocessingShape" mc:Ignorable="w14 w15 w16se w16cid w16 w16cex w16sdtdh w16sdtfl w16du wp14">
   <w:footnote w:type="separator" w:id="-1">
     <w:p>
       <w:pPr>
@@ -10358,7 +11584,7 @@
 </file>
 
 <file path=word/header1.xml><?xml version="1.0" encoding="utf-8"?>
-<w:hdr xmlns:wpc="http://schemas.microsoft.com/office/word/2010/wordprocessingCanvas" xmlns:cx="http://schemas.microsoft.com/office/drawing/2014/chartex" xmlns:cx1="http://schemas.microsoft.com/office/drawing/2015/9/8/chartex" xmlns:cx2="http://schemas.microsoft.com/office/drawing/2015/10/21/chartex" xmlns:cx3="http://schemas.microsoft.com/office/drawing/2016/5/9/chartex" xmlns:cx4="http://schemas.microsoft.com/office/drawing/2016/5/10/chartex" xmlns:cx5="http://schemas.microsoft.com/office/drawing/2016/5/11/chartex" xmlns:cx6="http://schemas.microsoft.com/office/drawing/2016/5/12/chartex" xmlns:cx7="http://schemas.microsoft.com/office/drawing/2016/5/13/chartex" xmlns:cx8="http://schemas.microsoft.com/office/drawing/2016/5/14/chartex" xmlns:mc="http://schemas.openxmlformats.org/markup-compatibility/2006" xmlns:aink="http://schemas.microsoft.com/office/drawing/2016/ink" xmlns:am3d="http://schemas.microsoft.com/office/drawing/2017/model3d" xmlns:o="urn:schemas-microsoft-com:office:office" xmlns:oel="http://schemas.microsoft.com/office/2019/extlst" xmlns:r="http://schemas.openxmlformats.org/officeDocument/2006/relationships" xmlns:m="http://schemas.openxmlformats.org/officeDocument/2006/math" xmlns:v="urn:schemas-microsoft-com:vml" xmlns:wp14="http://schemas.microsoft.com/office/word/2010/wordprocessingDrawing" xmlns:wp="http://schemas.openxmlformats.org/drawingml/2006/wordprocessingDrawing" xmlns:w10="urn:schemas-microsoft-com:office:word" xmlns:w="http://schemas.openxmlformats.org/wordprocessingml/2006/main" xmlns:w14="http://schemas.microsoft.com/office/word/2010/wordml" xmlns:w15="http://schemas.microsoft.com/office/word/2012/wordml" xmlns:w16cei="http://schemas.microsoft.com/office/word/2026/wordml/cei" xmlns:w16cex="http://schemas.microsoft.com/office/word/2018/wordml/cex" xmlns:w16cid="http://schemas.microsoft.com/office/word/2016/wordml/cid" xmlns:w16="http://schemas.microsoft.com/office/word/2018/wordml" xmlns:w16du="http://schemas.microsoft.com/office/word/2023/wordml/word16du" xmlns:w16sdtdh="http://schemas.microsoft.com/office/word/2020/wordml/sdtdatahash" xmlns:w16sdtfl="http://schemas.microsoft.com/office/word/2024/wordml/sdtformatlock" xmlns:w16se="http://schemas.microsoft.com/office/word/2015/wordml/symex" xmlns:wpg="http://schemas.microsoft.com/office/word/2010/wordprocessingGroup" xmlns:wpi="http://schemas.microsoft.com/office/word/2010/wordprocessingInk" xmlns:wne="http://schemas.microsoft.com/office/word/2006/wordml" xmlns:wps="http://schemas.microsoft.com/office/word/2010/wordprocessingShape" mc:Ignorable="w14 w15 w16se w16cid w16 w16cex w16sdtdh w16sdtfl w16du wp14">
+<w:hdr xmlns:wpc="http://schemas.microsoft.com/office/word/2010/wordprocessingCanvas" xmlns:cx="http://schemas.microsoft.com/office/drawing/2014/chartex" xmlns:cx1="http://schemas.microsoft.com/office/drawing/2015/9/8/chartex" xmlns:cx2="http://schemas.microsoft.com/office/drawing/2015/10/21/chartex" xmlns:cx3="http://schemas.microsoft.com/office/drawing/2016/5/9/chartex" xmlns:cx4="http://schemas.microsoft.com/office/drawing/2016/5/10/chartex" xmlns:cx5="http://schemas.microsoft.com/office/drawing/2016/5/11/chartex" xmlns:cx6="http://schemas.microsoft.com/office/drawing/2016/5/12/chartex" xmlns:cx7="http://schemas.microsoft.com/office/drawing/2016/5/13/chartex" xmlns:cx8="http://schemas.microsoft.com/office/drawing/2016/5/14/chartex" xmlns:mc="http://schemas.openxmlformats.org/markup-compatibility/2006" xmlns:aink="http://schemas.microsoft.com/office/drawing/2016/ink" xmlns:am3d="http://schemas.microsoft.com/office/drawing/2017/model3d" xmlns:o="urn:schemas-microsoft-com:office:office" xmlns:oel="http://schemas.microsoft.com/office/2019/extlst" xmlns:r="http://schemas.openxmlformats.org/officeDocument/2006/relationships" xmlns:m="http://schemas.openxmlformats.org/officeDocument/2006/math" xmlns:v="urn:schemas-microsoft-com:vml" xmlns:wp14="http://schemas.microsoft.com/office/word/2010/wordprocessingDrawing" xmlns:wp="http://schemas.openxmlformats.org/drawingml/2006/wordprocessingDrawing" xmlns:w10="urn:schemas-microsoft-com:office:word" xmlns:w="http://schemas.openxmlformats.org/wordprocessingml/2006/main" xmlns:w14="http://schemas.microsoft.com/office/word/2010/wordml" xmlns:w15="http://schemas.microsoft.com/office/word/2012/wordml" xmlns:w16cex="http://schemas.microsoft.com/office/word/2018/wordml/cex" xmlns:w16cid="http://schemas.microsoft.com/office/word/2016/wordml/cid" xmlns:w16="http://schemas.microsoft.com/office/word/2018/wordml" xmlns:w16du="http://schemas.microsoft.com/office/word/2023/wordml/word16du" xmlns:w16sdtdh="http://schemas.microsoft.com/office/word/2020/wordml/sdtdatahash" xmlns:w16sdtfl="http://schemas.microsoft.com/office/word/2024/wordml/sdtformatlock" xmlns:w16se="http://schemas.microsoft.com/office/word/2015/wordml/symex" xmlns:wpg="http://schemas.microsoft.com/office/word/2010/wordprocessingGroup" xmlns:wpi="http://schemas.microsoft.com/office/word/2010/wordprocessingInk" xmlns:wne="http://schemas.microsoft.com/office/word/2006/wordml" xmlns:wps="http://schemas.microsoft.com/office/word/2010/wordprocessingShape" mc:Ignorable="w14 w15 w16se w16cid w16 w16cex w16sdtdh w16sdtfl w16du wp14">
   <w:p>
     <w:pPr>
       <w:pStyle w:val="Header"/>
@@ -10371,7 +11597,7 @@
 </file>
 
 <file path=word/header2.xml><?xml version="1.0" encoding="utf-8"?>
-<w:hdr xmlns:wpc="http://schemas.microsoft.com/office/word/2010/wordprocessingCanvas" xmlns:cx="http://schemas.microsoft.com/office/drawing/2014/chartex" xmlns:cx1="http://schemas.microsoft.com/office/drawing/2015/9/8/chartex" xmlns:cx2="http://schemas.microsoft.com/office/drawing/2015/10/21/chartex" xmlns:cx3="http://schemas.microsoft.com/office/drawing/2016/5/9/chartex" xmlns:cx4="http://schemas.microsoft.com/office/drawing/2016/5/10/chartex" xmlns:cx5="http://schemas.microsoft.com/office/drawing/2016/5/11/chartex" xmlns:cx6="http://schemas.microsoft.com/office/drawing/2016/5/12/chartex" xmlns:cx7="http://schemas.microsoft.com/office/drawing/2016/5/13/chartex" xmlns:cx8="http://schemas.microsoft.com/office/drawing/2016/5/14/chartex" xmlns:mc="http://schemas.openxmlformats.org/markup-compatibility/2006" xmlns:aink="http://schemas.microsoft.com/office/drawing/2016/ink" xmlns:am3d="http://schemas.microsoft.com/office/drawing/2017/model3d" xmlns:o="urn:schemas-microsoft-com:office:office" xmlns:oel="http://schemas.microsoft.com/office/2019/extlst" xmlns:r="http://schemas.openxmlformats.org/officeDocument/2006/relationships" xmlns:m="http://schemas.openxmlformats.org/officeDocument/2006/math" xmlns:v="urn:schemas-microsoft-com:vml" xmlns:wp14="http://schemas.microsoft.com/office/word/2010/wordprocessingDrawing" xmlns:wp="http://schemas.openxmlformats.org/drawingml/2006/wordprocessingDrawing" xmlns:w10="urn:schemas-microsoft-com:office:word" xmlns:w="http://schemas.openxmlformats.org/wordprocessingml/2006/main" xmlns:w14="http://schemas.microsoft.com/office/word/2010/wordml" xmlns:w15="http://schemas.microsoft.com/office/word/2012/wordml" xmlns:w16cei="http://schemas.microsoft.com/office/word/2026/wordml/cei" xmlns:w16cex="http://schemas.microsoft.com/office/word/2018/wordml/cex" xmlns:w16cid="http://schemas.microsoft.com/office/word/2016/wordml/cid" xmlns:w16="http://schemas.microsoft.com/office/word/2018/wordml" xmlns:w16du="http://schemas.microsoft.com/office/word/2023/wordml/word16du" xmlns:w16sdtdh="http://schemas.microsoft.com/office/word/2020/wordml/sdtdatahash" xmlns:w16sdtfl="http://schemas.microsoft.com/office/word/2024/wordml/sdtformatlock" xmlns:w16se="http://schemas.microsoft.com/office/word/2015/wordml/symex" xmlns:wpg="http://schemas.microsoft.com/office/word/2010/wordprocessingGroup" xmlns:wpi="http://schemas.microsoft.com/office/word/2010/wordprocessingInk" xmlns:wne="http://schemas.microsoft.com/office/word/2006/wordml" xmlns:wps="http://schemas.microsoft.com/office/word/2010/wordprocessingShape" mc:Ignorable="w14 w15 w16se w16cid w16 w16cex w16sdtdh w16sdtfl w16du wp14">
+<w:hdr xmlns:wpc="http://schemas.microsoft.com/office/word/2010/wordprocessingCanvas" xmlns:cx="http://schemas.microsoft.com/office/drawing/2014/chartex" xmlns:cx1="http://schemas.microsoft.com/office/drawing/2015/9/8/chartex" xmlns:cx2="http://schemas.microsoft.com/office/drawing/2015/10/21/chartex" xmlns:cx3="http://schemas.microsoft.com/office/drawing/2016/5/9/chartex" xmlns:cx4="http://schemas.microsoft.com/office/drawing/2016/5/10/chartex" xmlns:cx5="http://schemas.microsoft.com/office/drawing/2016/5/11/chartex" xmlns:cx6="http://schemas.microsoft.com/office/drawing/2016/5/12/chartex" xmlns:cx7="http://schemas.microsoft.com/office/drawing/2016/5/13/chartex" xmlns:cx8="http://schemas.microsoft.com/office/drawing/2016/5/14/chartex" xmlns:mc="http://schemas.openxmlformats.org/markup-compatibility/2006" xmlns:aink="http://schemas.microsoft.com/office/drawing/2016/ink" xmlns:am3d="http://schemas.microsoft.com/office/drawing/2017/model3d" xmlns:o="urn:schemas-microsoft-com:office:office" xmlns:oel="http://schemas.microsoft.com/office/2019/extlst" xmlns:r="http://schemas.openxmlformats.org/officeDocument/2006/relationships" xmlns:m="http://schemas.openxmlformats.org/officeDocument/2006/math" xmlns:v="urn:schemas-microsoft-com:vml" xmlns:wp14="http://schemas.microsoft.com/office/word/2010/wordprocessingDrawing" xmlns:wp="http://schemas.openxmlformats.org/drawingml/2006/wordprocessingDrawing" xmlns:w10="urn:schemas-microsoft-com:office:word" xmlns:w="http://schemas.openxmlformats.org/wordprocessingml/2006/main" xmlns:w14="http://schemas.microsoft.com/office/word/2010/wordml" xmlns:w15="http://schemas.microsoft.com/office/word/2012/wordml" xmlns:w16cex="http://schemas.microsoft.com/office/word/2018/wordml/cex" xmlns:w16cid="http://schemas.microsoft.com/office/word/2016/wordml/cid" xmlns:w16="http://schemas.microsoft.com/office/word/2018/wordml" xmlns:w16du="http://schemas.microsoft.com/office/word/2023/wordml/word16du" xmlns:w16sdtdh="http://schemas.microsoft.com/office/word/2020/wordml/sdtdatahash" xmlns:w16sdtfl="http://schemas.microsoft.com/office/word/2024/wordml/sdtformatlock" xmlns:w16se="http://schemas.microsoft.com/office/word/2015/wordml/symex" xmlns:wpg="http://schemas.microsoft.com/office/word/2010/wordprocessingGroup" xmlns:wpi="http://schemas.microsoft.com/office/word/2010/wordprocessingInk" xmlns:wne="http://schemas.microsoft.com/office/word/2006/wordml" xmlns:wps="http://schemas.microsoft.com/office/word/2010/wordprocessingShape" mc:Ignorable="w14 w15 w16se w16cid w16 w16cex w16sdtdh w16sdtfl w16du wp14">
   <w:p>
     <w:pPr>
       <w:pStyle w:val="Header"/>

</xml_diff>